<commit_message>
feat: add evidence figures and protocol matrix
</commit_message>
<xml_diff>
--- a/output/docx/ROOT-Technical-Concept-Paper-D0.1.docx
+++ b/output/docx/ROOT-Technical-Concept-Paper-D0.1.docx
@@ -1578,6 +1578,266 @@
         <w:t>The proposed decision path uses bounded setpoints, bounded command rates, manual override, and a neutral fallback. An emitted infrared command is not treated as confirmed AC state. Conceptual architecture diagrams are not measured results.</w:t>
       </w:r>
     </w:p>
+    <w:tbl>
+      <w:tblPr>
+        <w:tblW w:type="dxa" w:w="9638"/>
+        <w:jc w:val="left"/>
+        <w:tblLayout w:type="fixed"/>
+        <w:tblLook w:firstColumn="1" w:firstRow="1" w:lastColumn="0" w:lastRow="0" w:noHBand="0" w:noVBand="1" w:val="04A0"/>
+        <w:tblInd w:type="dxa" w:w="120"/>
+        <w:tblBorders>
+          <w:top w:val="single" w:sz="4" w:space="0" w:color="D7D4CD"/>
+          <w:left w:val="single" w:sz="4" w:space="0" w:color="D7D4CD"/>
+          <w:bottom w:val="single" w:sz="4" w:space="0" w:color="D7D4CD"/>
+          <w:right w:val="single" w:sz="4" w:space="0" w:color="D7D4CD"/>
+          <w:insideH w:val="single" w:sz="4" w:space="0" w:color="D7D4CD"/>
+          <w:insideV w:val="single" w:sz="4" w:space="0" w:color="D7D4CD"/>
+        </w:tblBorders>
+      </w:tblPr>
+      <w:tblGrid>
+        <w:gridCol w:w="2410"/>
+        <w:gridCol w:w="2410"/>
+        <w:gridCol w:w="2410"/>
+        <w:gridCol w:w="2408"/>
+      </w:tblGrid>
+      <w:tr>
+        <w:trPr>
+          <w:tblHeader w:val="true"/>
+          <w:cantSplit/>
+        </w:trPr>
+        <w:tc>
+          <w:tcPr>
+            <w:tcW w:type="dxa" w:w="2410"/>
+            <w:vAlign w:val="center"/>
+            <w:tcMar>
+              <w:top w:w="80" w:type="dxa"/>
+              <w:bottom w:w="80" w:type="dxa"/>
+              <w:start w:w="120" w:type="dxa"/>
+              <w:end w:w="120" w:type="dxa"/>
+            </w:tcMar>
+            <w:shd w:val="clear" w:color="auto" w:fill="F2F1ED"/>
+          </w:tcPr>
+          <w:p>
+            <w:pPr>
+              <w:pStyle w:val="TableText"/>
+            </w:pPr>
+            <w:r>
+              <w:rPr>
+                <w:rFonts w:ascii="Arial" w:hAnsi="Arial" w:eastAsia="Arial" w:cs="Arial"/>
+                <w:b/>
+                <w:color w:val="20201F"/>
+                <w:sz w:val="16"/>
+              </w:rPr>
+              <w:t>1 | Sense</w:t>
+            </w:r>
+          </w:p>
+        </w:tc>
+        <w:tc>
+          <w:tcPr>
+            <w:tcW w:type="dxa" w:w="2410"/>
+            <w:vAlign w:val="center"/>
+            <w:tcMar>
+              <w:top w:w="80" w:type="dxa"/>
+              <w:bottom w:w="80" w:type="dxa"/>
+              <w:start w:w="120" w:type="dxa"/>
+              <w:end w:w="120" w:type="dxa"/>
+            </w:tcMar>
+            <w:shd w:val="clear" w:color="auto" w:fill="F2F1ED"/>
+          </w:tcPr>
+          <w:p>
+            <w:pPr>
+              <w:pStyle w:val="TableText"/>
+            </w:pPr>
+            <w:r>
+              <w:rPr>
+                <w:rFonts w:ascii="Arial" w:hAnsi="Arial" w:eastAsia="Arial" w:cs="Arial"/>
+                <w:b/>
+                <w:color w:val="20201F"/>
+                <w:sz w:val="16"/>
+              </w:rPr>
+              <w:t>2 | Interpret</w:t>
+            </w:r>
+          </w:p>
+        </w:tc>
+        <w:tc>
+          <w:tcPr>
+            <w:tcW w:type="dxa" w:w="2410"/>
+            <w:vAlign w:val="center"/>
+            <w:tcMar>
+              <w:top w:w="80" w:type="dxa"/>
+              <w:bottom w:w="80" w:type="dxa"/>
+              <w:start w:w="120" w:type="dxa"/>
+              <w:end w:w="120" w:type="dxa"/>
+            </w:tcMar>
+            <w:shd w:val="clear" w:color="auto" w:fill="F2F1ED"/>
+          </w:tcPr>
+          <w:p>
+            <w:pPr>
+              <w:pStyle w:val="TableText"/>
+            </w:pPr>
+            <w:r>
+              <w:rPr>
+                <w:rFonts w:ascii="Arial" w:hAnsi="Arial" w:eastAsia="Arial" w:cs="Arial"/>
+                <w:b/>
+                <w:color w:val="20201F"/>
+                <w:sz w:val="16"/>
+              </w:rPr>
+              <w:t>3 | Decide</w:t>
+            </w:r>
+          </w:p>
+        </w:tc>
+        <w:tc>
+          <w:tcPr>
+            <w:tcW w:type="dxa" w:w="2408"/>
+            <w:vAlign w:val="center"/>
+            <w:tcMar>
+              <w:top w:w="80" w:type="dxa"/>
+              <w:bottom w:w="80" w:type="dxa"/>
+              <w:start w:w="120" w:type="dxa"/>
+              <w:end w:w="120" w:type="dxa"/>
+            </w:tcMar>
+            <w:shd w:val="clear" w:color="auto" w:fill="F2F1ED"/>
+          </w:tcPr>
+          <w:p>
+            <w:pPr>
+              <w:pStyle w:val="TableText"/>
+            </w:pPr>
+            <w:r>
+              <w:rPr>
+                <w:rFonts w:ascii="Arial" w:hAnsi="Arial" w:eastAsia="Arial" w:cs="Arial"/>
+                <w:b/>
+                <w:color w:val="20201F"/>
+                <w:sz w:val="16"/>
+              </w:rPr>
+              <w:t>4 | Transmit</w:t>
+            </w:r>
+          </w:p>
+        </w:tc>
+      </w:tr>
+      <w:tr>
+        <w:trPr>
+          <w:cantSplit/>
+        </w:trPr>
+        <w:tc>
+          <w:tcPr>
+            <w:tcW w:type="dxa" w:w="2410"/>
+            <w:vAlign w:val="center"/>
+            <w:tcMar>
+              <w:top w:w="80" w:type="dxa"/>
+              <w:bottom w:w="80" w:type="dxa"/>
+              <w:start w:w="120" w:type="dxa"/>
+              <w:end w:w="120" w:type="dxa"/>
+            </w:tcMar>
+          </w:tcPr>
+          <w:p>
+            <w:pPr>
+              <w:pStyle w:val="TableText"/>
+            </w:pPr>
+            <w:r>
+              <w:rPr>
+                <w:rFonts w:ascii="Arial" w:hAnsi="Arial" w:eastAsia="Arial" w:cs="Arial"/>
+                <w:b w:val="0"/>
+                <w:color w:val="20201F"/>
+                <w:sz w:val="16"/>
+              </w:rPr>
+              <w:t>Sample temperature, humidity, and bounded presence context.</w:t>
+            </w:r>
+          </w:p>
+        </w:tc>
+        <w:tc>
+          <w:tcPr>
+            <w:tcW w:type="dxa" w:w="2410"/>
+            <w:vAlign w:val="center"/>
+            <w:tcMar>
+              <w:top w:w="80" w:type="dxa"/>
+              <w:bottom w:w="80" w:type="dxa"/>
+              <w:start w:w="120" w:type="dxa"/>
+              <w:end w:w="120" w:type="dxa"/>
+            </w:tcMar>
+          </w:tcPr>
+          <w:p>
+            <w:pPr>
+              <w:pStyle w:val="TableText"/>
+            </w:pPr>
+            <w:r>
+              <w:rPr>
+                <w:rFonts w:ascii="Arial" w:hAnsi="Arial" w:eastAsia="Arial" w:cs="Arial"/>
+                <w:b w:val="0"/>
+                <w:color w:val="20201F"/>
+                <w:sz w:val="16"/>
+              </w:rPr>
+              <w:t>Estimate local room context without inferring safety-critical state.</w:t>
+            </w:r>
+          </w:p>
+        </w:tc>
+        <w:tc>
+          <w:tcPr>
+            <w:tcW w:type="dxa" w:w="2410"/>
+            <w:vAlign w:val="center"/>
+            <w:tcMar>
+              <w:top w:w="80" w:type="dxa"/>
+              <w:bottom w:w="80" w:type="dxa"/>
+              <w:start w:w="120" w:type="dxa"/>
+              <w:end w:w="120" w:type="dxa"/>
+            </w:tcMar>
+          </w:tcPr>
+          <w:p>
+            <w:pPr>
+              <w:pStyle w:val="TableText"/>
+            </w:pPr>
+            <w:r>
+              <w:rPr>
+                <w:rFonts w:ascii="Arial" w:hAnsi="Arial" w:eastAsia="Arial" w:cs="Arial"/>
+                <w:b w:val="0"/>
+                <w:color w:val="20201F"/>
+                <w:sz w:val="16"/>
+              </w:rPr>
+              <w:t>Apply bounded setpoints, command rates, override, and fallback rules.</w:t>
+            </w:r>
+          </w:p>
+        </w:tc>
+        <w:tc>
+          <w:tcPr>
+            <w:tcW w:type="dxa" w:w="2408"/>
+            <w:vAlign w:val="center"/>
+            <w:tcMar>
+              <w:top w:w="80" w:type="dxa"/>
+              <w:bottom w:w="80" w:type="dxa"/>
+              <w:start w:w="120" w:type="dxa"/>
+              <w:end w:w="120" w:type="dxa"/>
+            </w:tcMar>
+          </w:tcPr>
+          <w:p>
+            <w:pPr>
+              <w:pStyle w:val="TableText"/>
+            </w:pPr>
+            <w:r>
+              <w:rPr>
+                <w:rFonts w:ascii="Arial" w:hAnsi="Arial" w:eastAsia="Arial" w:cs="Arial"/>
+                <w:b w:val="0"/>
+                <w:color w:val="20201F"/>
+                <w:sz w:val="16"/>
+              </w:rPr>
+              <w:t>Emit a learned IR command without assuming confirmed AC state.</w:t>
+            </w:r>
+          </w:p>
+        </w:tc>
+      </w:tr>
+    </w:tbl>
+    <w:p>
+      <w:pPr>
+        <w:pStyle w:val="Caption"/>
+        <w:keepNext/>
+      </w:pPr>
+      <w:r>
+        <w:t>Figure 1. Conceptual four-stage control loop. Conceptual architecture, not a measured result. Status: Hypothesis / design target. Claim ID: HT-01.</w:t>
+      </w:r>
+    </w:p>
+    <w:p>
+      <w:r>
+        <w:t>Signal path: environmental and bounded presence inputs -&gt; local interpretation -&gt; bounded local decision -&gt; learned IR transmission. The proposed loop does not provide confirmed AC-state feedback.</w:t>
+      </w:r>
+    </w:p>
     <w:p>
       <w:pPr>
         <w:pStyle w:val="Heading2"/>
@@ -1716,6 +1976,55 @@
     </w:p>
     <w:p>
       <w:pPr>
+        <w:keepNext/>
+        <w:jc w:val="center"/>
+      </w:pPr>
+      <w:r>
+        <w:drawing>
+          <wp:inline xmlns:a="http://schemas.openxmlformats.org/drawingml/2006/main" xmlns:pic="http://schemas.openxmlformats.org/drawingml/2006/picture">
+            <wp:extent cx="3780000" cy="3780000"/>
+            <wp:docPr id="1" name="Picture 1" descr="Illustrative cutaway of the proposed ROOT room-comfort controller; not component or production evidence." title="Illustrative ROOT product cutaway"/>
+            <wp:cNvGraphicFramePr>
+              <a:graphicFrameLocks noChangeAspect="1"/>
+            </wp:cNvGraphicFramePr>
+            <a:graphic>
+              <a:graphicData uri="http://schemas.openxmlformats.org/drawingml/2006/picture">
+                <pic:pic>
+                  <pic:nvPicPr>
+                    <pic:cNvPr id="0" name="root-matte-technical-cutaway-v1.png"/>
+                    <pic:cNvPicPr/>
+                  </pic:nvPicPr>
+                  <pic:blipFill>
+                    <a:blip r:embed="rId11"/>
+                    <a:stretch>
+                      <a:fillRect/>
+                    </a:stretch>
+                  </pic:blipFill>
+                  <pic:spPr>
+                    <a:xfrm>
+                      <a:off x="0" y="0"/>
+                      <a:ext cx="3780000" cy="3780000"/>
+                    </a:xfrm>
+                    <a:prstGeom prst="rect"/>
+                  </pic:spPr>
+                </pic:pic>
+              </a:graphicData>
+            </a:graphic>
+          </wp:inline>
+        </w:drawing>
+      </w:r>
+    </w:p>
+    <w:p>
+      <w:pPr>
+        <w:pStyle w:val="Caption"/>
+        <w:keepNext w:val="0"/>
+      </w:pPr>
+      <w:r>
+        <w:t>Figure 2. Illustrative ROOT product cutaway. Illustrative image, not component or production evidence. Status: Hypothesis / design target. Claim ID: HT-03.</w:t>
+      </w:r>
+    </w:p>
+    <w:p>
+      <w:pPr>
         <w:pStyle w:val="Heading1"/>
         <w:keepNext/>
         <w:spacing w:before="360" w:after="160"/>
@@ -1784,12 +2093,13 @@
         </w:tblBorders>
       </w:tblPr>
       <w:tblGrid>
-        <w:gridCol w:w="771"/>
-        <w:gridCol w:w="1478"/>
-        <w:gridCol w:w="1542"/>
-        <w:gridCol w:w="1671"/>
-        <w:gridCol w:w="1478"/>
-        <w:gridCol w:w="2698"/>
+        <w:gridCol w:w="741"/>
+        <w:gridCol w:w="1348"/>
+        <w:gridCol w:w="1348"/>
+        <w:gridCol w:w="1146"/>
+        <w:gridCol w:w="1281"/>
+        <w:gridCol w:w="1011"/>
+        <w:gridCol w:w="2763"/>
       </w:tblGrid>
       <w:tr>
         <w:trPr>
@@ -1798,7 +2108,7 @@
         </w:trPr>
         <w:tc>
           <w:tcPr>
-            <w:tcW w:type="dxa" w:w="771"/>
+            <w:tcW w:type="dxa" w:w="741"/>
             <w:vAlign w:val="center"/>
             <w:tcMar>
               <w:top w:w="80" w:type="dxa"/>
@@ -1819,13 +2129,13 @@
                 <w:color w:val="20201F"/>
                 <w:sz w:val="16"/>
               </w:rPr>
-              <w:t>ID</w:t>
+              <w:t>Claim ID</w:t>
             </w:r>
           </w:p>
         </w:tc>
         <w:tc>
           <w:tcPr>
-            <w:tcW w:type="dxa" w:w="1478"/>
+            <w:tcW w:type="dxa" w:w="1348"/>
             <w:vAlign w:val="center"/>
             <w:tcMar>
               <w:top w:w="80" w:type="dxa"/>
@@ -1852,7 +2162,7 @@
         </w:tc>
         <w:tc>
           <w:tcPr>
-            <w:tcW w:type="dxa" w:w="1542"/>
+            <w:tcW w:type="dxa" w:w="1348"/>
             <w:vAlign w:val="center"/>
             <w:tcMar>
               <w:top w:w="80" w:type="dxa"/>
@@ -1879,7 +2189,7 @@
         </w:tc>
         <w:tc>
           <w:tcPr>
-            <w:tcW w:type="dxa" w:w="1671"/>
+            <w:tcW w:type="dxa" w:w="1146"/>
             <w:vAlign w:val="center"/>
             <w:tcMar>
               <w:top w:w="80" w:type="dxa"/>
@@ -1900,13 +2210,13 @@
                 <w:color w:val="20201F"/>
                 <w:sz w:val="16"/>
               </w:rPr>
-              <w:t>Revision basis</w:t>
+              <w:t>Revision</w:t>
             </w:r>
           </w:p>
         </w:tc>
         <w:tc>
           <w:tcPr>
-            <w:tcW w:type="dxa" w:w="1478"/>
+            <w:tcW w:type="dxa" w:w="1281"/>
             <w:vAlign w:val="center"/>
             <w:tcMar>
               <w:top w:w="80" w:type="dxa"/>
@@ -1927,13 +2237,13 @@
                 <w:color w:val="20201F"/>
                 <w:sz w:val="16"/>
               </w:rPr>
-              <w:t>Evidence</w:t>
+              <w:t>Evidence ID</w:t>
             </w:r>
           </w:p>
         </w:tc>
         <w:tc>
           <w:tcPr>
-            <w:tcW w:type="dxa" w:w="2698"/>
+            <w:tcW w:type="dxa" w:w="1011"/>
             <w:vAlign w:val="center"/>
             <w:tcMar>
               <w:top w:w="80" w:type="dxa"/>
@@ -1954,7 +2264,34 @@
                 <w:color w:val="20201F"/>
                 <w:sz w:val="16"/>
               </w:rPr>
-              <w:t>Controlled wording</w:t>
+              <w:t>Evidence date</w:t>
+            </w:r>
+          </w:p>
+        </w:tc>
+        <w:tc>
+          <w:tcPr>
+            <w:tcW w:type="dxa" w:w="2763"/>
+            <w:vAlign w:val="center"/>
+            <w:tcMar>
+              <w:top w:w="80" w:type="dxa"/>
+              <w:bottom w:w="80" w:type="dxa"/>
+              <w:start w:w="120" w:type="dxa"/>
+              <w:end w:w="120" w:type="dxa"/>
+            </w:tcMar>
+            <w:shd w:val="clear" w:color="auto" w:fill="F2F1ED"/>
+          </w:tcPr>
+          <w:p>
+            <w:pPr>
+              <w:pStyle w:val="TableText"/>
+            </w:pPr>
+            <w:r>
+              <w:rPr>
+                <w:rFonts w:ascii="Arial" w:hAnsi="Arial" w:eastAsia="Arial" w:cs="Arial"/>
+                <w:b/>
+                <w:color w:val="20201F"/>
+                <w:sz w:val="16"/>
+              </w:rPr>
+              <w:t>Control record</w:t>
             </w:r>
           </w:p>
         </w:tc>
@@ -1965,7 +2302,7 @@
         </w:trPr>
         <w:tc>
           <w:tcPr>
-            <w:tcW w:type="dxa" w:w="771"/>
+            <w:tcW w:type="dxa" w:w="741"/>
             <w:vAlign w:val="center"/>
             <w:tcMar>
               <w:top w:w="80" w:type="dxa"/>
@@ -1991,7 +2328,7 @@
         </w:tc>
         <w:tc>
           <w:tcPr>
-            <w:tcW w:type="dxa" w:w="1478"/>
+            <w:tcW w:type="dxa" w:w="1348"/>
             <w:vAlign w:val="center"/>
             <w:tcMar>
               <w:top w:w="80" w:type="dxa"/>
@@ -2017,7 +2354,7 @@
         </w:tc>
         <w:tc>
           <w:tcPr>
-            <w:tcW w:type="dxa" w:w="1542"/>
+            <w:tcW w:type="dxa" w:w="1348"/>
             <w:vAlign w:val="center"/>
             <w:tcMar>
               <w:top w:w="80" w:type="dxa"/>
@@ -2043,7 +2380,7 @@
         </w:tc>
         <w:tc>
           <w:tcPr>
-            <w:tcW w:type="dxa" w:w="1671"/>
+            <w:tcW w:type="dxa" w:w="1146"/>
             <w:vAlign w:val="center"/>
             <w:tcMar>
               <w:top w:w="80" w:type="dxa"/>
@@ -2063,15 +2400,13 @@
                 <w:color w:val="20201F"/>
                 <w:sz w:val="16"/>
               </w:rPr>
-              <w:t>HW/FW: Not applicable</w:t>
-              <w:br/>
-              <w:t>Claim rev.: Not applicable</w:t>
+              <w:t>Not applicable</w:t>
             </w:r>
           </w:p>
         </w:tc>
         <w:tc>
           <w:tcPr>
-            <w:tcW w:type="dxa" w:w="1478"/>
+            <w:tcW w:type="dxa" w:w="1281"/>
             <w:vAlign w:val="center"/>
             <w:tcMar>
               <w:top w:w="80" w:type="dxa"/>
@@ -2092,14 +2427,12 @@
                 <w:sz w:val="16"/>
               </w:rPr>
               <w:t>REF-01</w:t>
-              <w:br/>
-              <w:t>2026</w:t>
             </w:r>
           </w:p>
         </w:tc>
         <w:tc>
           <w:tcPr>
-            <w:tcW w:type="dxa" w:w="2698"/>
+            <w:tcW w:type="dxa" w:w="1011"/>
             <w:vAlign w:val="center"/>
             <w:tcMar>
               <w:top w:w="80" w:type="dxa"/>
@@ -2119,9 +2452,43 @@
                 <w:color w:val="20201F"/>
                 <w:sz w:val="16"/>
               </w:rPr>
-              <w:t>Non-uniform conditions can arise in split-AC rooms, so a single return-air reference may not fully describe conditions near an occupant.</w:t>
+              <w:t>2026</w:t>
+            </w:r>
+          </w:p>
+        </w:tc>
+        <w:tc>
+          <w:tcPr>
+            <w:tcW w:type="dxa" w:w="2763"/>
+            <w:vAlign w:val="center"/>
+            <w:tcMar>
+              <w:top w:w="80" w:type="dxa"/>
+              <w:bottom w:w="80" w:type="dxa"/>
+              <w:start w:w="120" w:type="dxa"/>
+              <w:end w:w="120" w:type="dxa"/>
+            </w:tcMar>
+          </w:tcPr>
+          <w:p>
+            <w:pPr>
+              <w:pStyle w:val="TableText"/>
+            </w:pPr>
+            <w:r>
+              <w:rPr>
+                <w:rFonts w:ascii="Arial" w:hAnsi="Arial" w:eastAsia="Arial" w:cs="Arial"/>
+                <w:b w:val="0"/>
+                <w:color w:val="20201F"/>
+                <w:sz w:val="16"/>
+              </w:rPr>
+              <w:t>Wording: Non-uniform conditions can arise in split-AC rooms, so a single return-air reference may not fully describe conditions near an occupant.</w:t>
               <w:br/>
-              <w:t>Owner: Haptique Electronics Pvt. Ltd. | Review: 25 August 2026</w:t>
+              <w:t>Owner: Haptique Electronics Pvt. Ltd.</w:t>
+              <w:br/>
+              <w:t>Review date: 25 August 2026</w:t>
+              <w:br/>
+              <w:t>Superseded wording: None recorded</w:t>
+              <w:br/>
+              <w:t>Hardware revision: Not applicable</w:t>
+              <w:br/>
+              <w:t>Firmware revision: Not applicable</w:t>
             </w:r>
           </w:p>
         </w:tc>
@@ -2132,7 +2499,7 @@
         </w:trPr>
         <w:tc>
           <w:tcPr>
-            <w:tcW w:type="dxa" w:w="771"/>
+            <w:tcW w:type="dxa" w:w="741"/>
             <w:vAlign w:val="center"/>
             <w:tcMar>
               <w:top w:w="80" w:type="dxa"/>
@@ -2158,7 +2525,7 @@
         </w:tc>
         <w:tc>
           <w:tcPr>
-            <w:tcW w:type="dxa" w:w="1478"/>
+            <w:tcW w:type="dxa" w:w="1348"/>
             <w:vAlign w:val="center"/>
             <w:tcMar>
               <w:top w:w="80" w:type="dxa"/>
@@ -2184,7 +2551,7 @@
         </w:tc>
         <w:tc>
           <w:tcPr>
-            <w:tcW w:type="dxa" w:w="1542"/>
+            <w:tcW w:type="dxa" w:w="1348"/>
             <w:vAlign w:val="center"/>
             <w:tcMar>
               <w:top w:w="80" w:type="dxa"/>
@@ -2210,7 +2577,7 @@
         </w:tc>
         <w:tc>
           <w:tcPr>
-            <w:tcW w:type="dxa" w:w="1671"/>
+            <w:tcW w:type="dxa" w:w="1146"/>
             <w:vAlign w:val="center"/>
             <w:tcMar>
               <w:top w:w="80" w:type="dxa"/>
@@ -2230,15 +2597,13 @@
                 <w:color w:val="20201F"/>
                 <w:sz w:val="16"/>
               </w:rPr>
-              <w:t>HW/FW: Target revision not yet assigned</w:t>
-              <w:br/>
-              <w:t>Claim rev.: Target revision not yet assigned</w:t>
+              <w:t>Target revision not yet assigned</w:t>
             </w:r>
           </w:p>
         </w:tc>
         <w:tc>
           <w:tcPr>
-            <w:tcW w:type="dxa" w:w="1478"/>
+            <w:tcW w:type="dxa" w:w="1281"/>
             <w:vAlign w:val="center"/>
             <w:tcMar>
               <w:top w:w="80" w:type="dxa"/>
@@ -2259,14 +2624,12 @@
                 <w:sz w:val="16"/>
               </w:rPr>
               <w:t>DESIGN-REVIEW-2026-08-25</w:t>
-              <w:br/>
-              <w:t>25 August 2026</w:t>
             </w:r>
           </w:p>
         </w:tc>
         <w:tc>
           <w:tcPr>
-            <w:tcW w:type="dxa" w:w="2698"/>
+            <w:tcW w:type="dxa" w:w="1011"/>
             <w:vAlign w:val="center"/>
             <w:tcMar>
               <w:top w:w="80" w:type="dxa"/>
@@ -2286,9 +2649,43 @@
                 <w:color w:val="20201F"/>
                 <w:sz w:val="16"/>
               </w:rPr>
-              <w:t>ROOT is designed to sense room context, decide locally within bounded controls, and transmit a learned IR adjustment.</w:t>
+              <w:t>25 August 2026</w:t>
+            </w:r>
+          </w:p>
+        </w:tc>
+        <w:tc>
+          <w:tcPr>
+            <w:tcW w:type="dxa" w:w="2763"/>
+            <w:vAlign w:val="center"/>
+            <w:tcMar>
+              <w:top w:w="80" w:type="dxa"/>
+              <w:bottom w:w="80" w:type="dxa"/>
+              <w:start w:w="120" w:type="dxa"/>
+              <w:end w:w="120" w:type="dxa"/>
+            </w:tcMar>
+          </w:tcPr>
+          <w:p>
+            <w:pPr>
+              <w:pStyle w:val="TableText"/>
+            </w:pPr>
+            <w:r>
+              <w:rPr>
+                <w:rFonts w:ascii="Arial" w:hAnsi="Arial" w:eastAsia="Arial" w:cs="Arial"/>
+                <w:b w:val="0"/>
+                <w:color w:val="20201F"/>
+                <w:sz w:val="16"/>
+              </w:rPr>
+              <w:t>Wording: ROOT is designed to sense room context, decide locally within bounded controls, and transmit a learned IR adjustment.</w:t>
               <w:br/>
-              <w:t>Owner: Haptique Electronics Pvt. Ltd. | Review: 25 August 2026</w:t>
+              <w:t>Owner: Haptique Electronics Pvt. Ltd.</w:t>
+              <w:br/>
+              <w:t>Review date: 25 August 2026</w:t>
+              <w:br/>
+              <w:t>Superseded wording: None recorded</w:t>
+              <w:br/>
+              <w:t>Hardware revision: Target revision not yet assigned</w:t>
+              <w:br/>
+              <w:t>Firmware revision: Target revision not yet assigned</w:t>
             </w:r>
           </w:p>
         </w:tc>
@@ -2299,7 +2696,7 @@
         </w:trPr>
         <w:tc>
           <w:tcPr>
-            <w:tcW w:type="dxa" w:w="771"/>
+            <w:tcW w:type="dxa" w:w="741"/>
             <w:vAlign w:val="center"/>
             <w:tcMar>
               <w:top w:w="80" w:type="dxa"/>
@@ -2325,7 +2722,7 @@
         </w:tc>
         <w:tc>
           <w:tcPr>
-            <w:tcW w:type="dxa" w:w="1478"/>
+            <w:tcW w:type="dxa" w:w="1348"/>
             <w:vAlign w:val="center"/>
             <w:tcMar>
               <w:top w:w="80" w:type="dxa"/>
@@ -2351,7 +2748,7 @@
         </w:tc>
         <w:tc>
           <w:tcPr>
-            <w:tcW w:type="dxa" w:w="1542"/>
+            <w:tcW w:type="dxa" w:w="1348"/>
             <w:vAlign w:val="center"/>
             <w:tcMar>
               <w:top w:w="80" w:type="dxa"/>
@@ -2377,7 +2774,7 @@
         </w:tc>
         <w:tc>
           <w:tcPr>
-            <w:tcW w:type="dxa" w:w="1671"/>
+            <w:tcW w:type="dxa" w:w="1146"/>
             <w:vAlign w:val="center"/>
             <w:tcMar>
               <w:top w:w="80" w:type="dxa"/>
@@ -2397,15 +2794,13 @@
                 <w:color w:val="20201F"/>
                 <w:sz w:val="16"/>
               </w:rPr>
-              <w:t>HW/FW: Target revision not yet assigned</w:t>
-              <w:br/>
-              <w:t>Claim rev.: Target revision not yet assigned</w:t>
+              <w:t>Target revision not yet assigned</w:t>
             </w:r>
           </w:p>
         </w:tc>
         <w:tc>
           <w:tcPr>
-            <w:tcW w:type="dxa" w:w="1478"/>
+            <w:tcW w:type="dxa" w:w="1281"/>
             <w:vAlign w:val="center"/>
             <w:tcMar>
               <w:top w:w="80" w:type="dxa"/>
@@ -2426,14 +2821,12 @@
                 <w:sz w:val="16"/>
               </w:rPr>
               <w:t>REF-02; DESIGN-REVIEW-2026-08-25</w:t>
-              <w:br/>
-              <w:t>25 August 2026</w:t>
             </w:r>
           </w:p>
         </w:tc>
         <w:tc>
           <w:tcPr>
-            <w:tcW w:type="dxa" w:w="2698"/>
+            <w:tcW w:type="dxa" w:w="1011"/>
             <w:vAlign w:val="center"/>
             <w:tcMar>
               <w:top w:w="80" w:type="dxa"/>
@@ -2453,9 +2846,43 @@
                 <w:color w:val="20201F"/>
                 <w:sz w:val="16"/>
               </w:rPr>
-              <w:t>Bluetooth is a proposed setup or coarse-proximity pathway, while the intended core sensing, decision, and IR paths operate on the device after configuration.</w:t>
+              <w:t>25 August 2026</w:t>
+            </w:r>
+          </w:p>
+        </w:tc>
+        <w:tc>
+          <w:tcPr>
+            <w:tcW w:type="dxa" w:w="2763"/>
+            <w:vAlign w:val="center"/>
+            <w:tcMar>
+              <w:top w:w="80" w:type="dxa"/>
+              <w:bottom w:w="80" w:type="dxa"/>
+              <w:start w:w="120" w:type="dxa"/>
+              <w:end w:w="120" w:type="dxa"/>
+            </w:tcMar>
+          </w:tcPr>
+          <w:p>
+            <w:pPr>
+              <w:pStyle w:val="TableText"/>
+            </w:pPr>
+            <w:r>
+              <w:rPr>
+                <w:rFonts w:ascii="Arial" w:hAnsi="Arial" w:eastAsia="Arial" w:cs="Arial"/>
+                <w:b w:val="0"/>
+                <w:color w:val="20201F"/>
+                <w:sz w:val="16"/>
+              </w:rPr>
+              <w:t>Wording: Bluetooth is a proposed setup or coarse-proximity pathway, while the intended core sensing, decision, and IR paths operate on the device after configuration.</w:t>
               <w:br/>
-              <w:t>Owner: Haptique Electronics Pvt. Ltd. | Review: 25 August 2026</w:t>
+              <w:t>Owner: Haptique Electronics Pvt. Ltd.</w:t>
+              <w:br/>
+              <w:t>Review date: 25 August 2026</w:t>
+              <w:br/>
+              <w:t>Superseded wording: None recorded</w:t>
+              <w:br/>
+              <w:t>Hardware revision: Target revision not yet assigned</w:t>
+              <w:br/>
+              <w:t>Firmware revision: Target revision not yet assigned</w:t>
             </w:r>
           </w:p>
         </w:tc>
@@ -2466,7 +2893,7 @@
         </w:trPr>
         <w:tc>
           <w:tcPr>
-            <w:tcW w:type="dxa" w:w="771"/>
+            <w:tcW w:type="dxa" w:w="741"/>
             <w:vAlign w:val="center"/>
             <w:tcMar>
               <w:top w:w="80" w:type="dxa"/>
@@ -2492,7 +2919,7 @@
         </w:tc>
         <w:tc>
           <w:tcPr>
-            <w:tcW w:type="dxa" w:w="1478"/>
+            <w:tcW w:type="dxa" w:w="1348"/>
             <w:vAlign w:val="center"/>
             <w:tcMar>
               <w:top w:w="80" w:type="dxa"/>
@@ -2518,7 +2945,7 @@
         </w:tc>
         <w:tc>
           <w:tcPr>
-            <w:tcW w:type="dxa" w:w="1542"/>
+            <w:tcW w:type="dxa" w:w="1348"/>
             <w:vAlign w:val="center"/>
             <w:tcMar>
               <w:top w:w="80" w:type="dxa"/>
@@ -2544,7 +2971,7 @@
         </w:tc>
         <w:tc>
           <w:tcPr>
-            <w:tcW w:type="dxa" w:w="1671"/>
+            <w:tcW w:type="dxa" w:w="1146"/>
             <w:vAlign w:val="center"/>
             <w:tcMar>
               <w:top w:w="80" w:type="dxa"/>
@@ -2564,15 +2991,13 @@
                 <w:color w:val="20201F"/>
                 <w:sz w:val="16"/>
               </w:rPr>
-              <w:t>HW/FW: Target revision not yet assigned</w:t>
-              <w:br/>
-              <w:t>Claim rev.: Target revision not yet assigned</w:t>
+              <w:t>Target revision not yet assigned</w:t>
             </w:r>
           </w:p>
         </w:tc>
         <w:tc>
           <w:tcPr>
-            <w:tcW w:type="dxa" w:w="1478"/>
+            <w:tcW w:type="dxa" w:w="1281"/>
             <w:vAlign w:val="center"/>
             <w:tcMar>
               <w:top w:w="80" w:type="dxa"/>
@@ -2593,14 +3018,12 @@
                 <w:sz w:val="16"/>
               </w:rPr>
               <w:t>DESIGN-REVIEW-2026-08-25</w:t>
-              <w:br/>
-              <w:t>25 August 2026</w:t>
             </w:r>
           </w:p>
         </w:tc>
         <w:tc>
           <w:tcPr>
-            <w:tcW w:type="dxa" w:w="2698"/>
+            <w:tcW w:type="dxa" w:w="1011"/>
             <w:vAlign w:val="center"/>
             <w:tcMar>
               <w:top w:w="80" w:type="dxa"/>
@@ -2620,9 +3043,43 @@
                 <w:color w:val="20201F"/>
                 <w:sz w:val="16"/>
               </w:rPr>
-              <w:t>Temperature, humidity, presence sensing, IR learning, and IR transmission require integrated validation before accuracy, reach, or compatibility claims are made.</w:t>
+              <w:t>25 August 2026</w:t>
+            </w:r>
+          </w:p>
+        </w:tc>
+        <w:tc>
+          <w:tcPr>
+            <w:tcW w:type="dxa" w:w="2763"/>
+            <w:vAlign w:val="center"/>
+            <w:tcMar>
+              <w:top w:w="80" w:type="dxa"/>
+              <w:bottom w:w="80" w:type="dxa"/>
+              <w:start w:w="120" w:type="dxa"/>
+              <w:end w:w="120" w:type="dxa"/>
+            </w:tcMar>
+          </w:tcPr>
+          <w:p>
+            <w:pPr>
+              <w:pStyle w:val="TableText"/>
+            </w:pPr>
+            <w:r>
+              <w:rPr>
+                <w:rFonts w:ascii="Arial" w:hAnsi="Arial" w:eastAsia="Arial" w:cs="Arial"/>
+                <w:b w:val="0"/>
+                <w:color w:val="20201F"/>
+                <w:sz w:val="16"/>
+              </w:rPr>
+              <w:t>Wording: Temperature, humidity, presence sensing, IR learning, and IR transmission require integrated validation before accuracy, reach, or compatibility claims are made.</w:t>
               <w:br/>
-              <w:t>Owner: Haptique Electronics Pvt. Ltd. | Review: 25 August 2026</w:t>
+              <w:t>Owner: Haptique Electronics Pvt. Ltd.</w:t>
+              <w:br/>
+              <w:t>Review date: 25 August 2026</w:t>
+              <w:br/>
+              <w:t>Superseded wording: None recorded</w:t>
+              <w:br/>
+              <w:t>Hardware revision: Target revision not yet assigned</w:t>
+              <w:br/>
+              <w:t>Firmware revision: Target revision not yet assigned</w:t>
             </w:r>
           </w:p>
         </w:tc>
@@ -2633,7 +3090,7 @@
         </w:trPr>
         <w:tc>
           <w:tcPr>
-            <w:tcW w:type="dxa" w:w="771"/>
+            <w:tcW w:type="dxa" w:w="741"/>
             <w:vAlign w:val="center"/>
             <w:tcMar>
               <w:top w:w="80" w:type="dxa"/>
@@ -2659,7 +3116,7 @@
         </w:tc>
         <w:tc>
           <w:tcPr>
-            <w:tcW w:type="dxa" w:w="1478"/>
+            <w:tcW w:type="dxa" w:w="1348"/>
             <w:vAlign w:val="center"/>
             <w:tcMar>
               <w:top w:w="80" w:type="dxa"/>
@@ -2685,7 +3142,7 @@
         </w:tc>
         <w:tc>
           <w:tcPr>
-            <w:tcW w:type="dxa" w:w="1542"/>
+            <w:tcW w:type="dxa" w:w="1348"/>
             <w:vAlign w:val="center"/>
             <w:tcMar>
               <w:top w:w="80" w:type="dxa"/>
@@ -2711,7 +3168,7 @@
         </w:tc>
         <w:tc>
           <w:tcPr>
-            <w:tcW w:type="dxa" w:w="1671"/>
+            <w:tcW w:type="dxa" w:w="1146"/>
             <w:vAlign w:val="center"/>
             <w:tcMar>
               <w:top w:w="80" w:type="dxa"/>
@@ -2731,15 +3188,13 @@
                 <w:color w:val="20201F"/>
                 <w:sz w:val="16"/>
               </w:rPr>
-              <w:t>HW/FW: Target revision not yet assigned</w:t>
-              <w:br/>
-              <w:t>Claim rev.: Target revision not yet assigned</w:t>
+              <w:t>Target revision not yet assigned</w:t>
             </w:r>
           </w:p>
         </w:tc>
         <w:tc>
           <w:tcPr>
-            <w:tcW w:type="dxa" w:w="1478"/>
+            <w:tcW w:type="dxa" w:w="1281"/>
             <w:vAlign w:val="center"/>
             <w:tcMar>
               <w:top w:w="80" w:type="dxa"/>
@@ -2760,14 +3215,12 @@
                 <w:sz w:val="16"/>
               </w:rPr>
               <w:t>DESIGN-REVIEW-2026-08-25</w:t>
-              <w:br/>
-              <w:t>25 August 2026</w:t>
             </w:r>
           </w:p>
         </w:tc>
         <w:tc>
           <w:tcPr>
-            <w:tcW w:type="dxa" w:w="2698"/>
+            <w:tcW w:type="dxa" w:w="1011"/>
             <w:vAlign w:val="center"/>
             <w:tcMar>
               <w:top w:w="80" w:type="dxa"/>
@@ -2787,9 +3240,43 @@
                 <w:color w:val="20201F"/>
                 <w:sz w:val="16"/>
               </w:rPr>
-              <w:t>Placement affects sampled conditions, obstruction, airflow exposure, line of sight, IR reach, mounting stability, and presence-detection behavior.</w:t>
+              <w:t>25 August 2026</w:t>
+            </w:r>
+          </w:p>
+        </w:tc>
+        <w:tc>
+          <w:tcPr>
+            <w:tcW w:type="dxa" w:w="2763"/>
+            <w:vAlign w:val="center"/>
+            <w:tcMar>
+              <w:top w:w="80" w:type="dxa"/>
+              <w:bottom w:w="80" w:type="dxa"/>
+              <w:start w:w="120" w:type="dxa"/>
+              <w:end w:w="120" w:type="dxa"/>
+            </w:tcMar>
+          </w:tcPr>
+          <w:p>
+            <w:pPr>
+              <w:pStyle w:val="TableText"/>
+            </w:pPr>
+            <w:r>
+              <w:rPr>
+                <w:rFonts w:ascii="Arial" w:hAnsi="Arial" w:eastAsia="Arial" w:cs="Arial"/>
+                <w:b w:val="0"/>
+                <w:color w:val="20201F"/>
+                <w:sz w:val="16"/>
+              </w:rPr>
+              <w:t>Wording: Placement affects sampled conditions, obstruction, airflow exposure, line of sight, IR reach, mounting stability, and presence-detection behavior.</w:t>
               <w:br/>
-              <w:t>Owner: Haptique Electronics Pvt. Ltd. | Review: 25 August 2026</w:t>
+              <w:t>Owner: Haptique Electronics Pvt. Ltd.</w:t>
+              <w:br/>
+              <w:t>Review date: 25 August 2026</w:t>
+              <w:br/>
+              <w:t>Superseded wording: None recorded</w:t>
+              <w:br/>
+              <w:t>Hardware revision: Target revision not yet assigned</w:t>
+              <w:br/>
+              <w:t>Firmware revision: Target revision not yet assigned</w:t>
             </w:r>
           </w:p>
         </w:tc>
@@ -2800,7 +3287,7 @@
         </w:trPr>
         <w:tc>
           <w:tcPr>
-            <w:tcW w:type="dxa" w:w="771"/>
+            <w:tcW w:type="dxa" w:w="741"/>
             <w:vAlign w:val="center"/>
             <w:tcMar>
               <w:top w:w="80" w:type="dxa"/>
@@ -2826,7 +3313,7 @@
         </w:tc>
         <w:tc>
           <w:tcPr>
-            <w:tcW w:type="dxa" w:w="1478"/>
+            <w:tcW w:type="dxa" w:w="1348"/>
             <w:vAlign w:val="center"/>
             <w:tcMar>
               <w:top w:w="80" w:type="dxa"/>
@@ -2852,7 +3339,7 @@
         </w:tc>
         <w:tc>
           <w:tcPr>
-            <w:tcW w:type="dxa" w:w="1542"/>
+            <w:tcW w:type="dxa" w:w="1348"/>
             <w:vAlign w:val="center"/>
             <w:tcMar>
               <w:top w:w="80" w:type="dxa"/>
@@ -2878,7 +3365,7 @@
         </w:tc>
         <w:tc>
           <w:tcPr>
-            <w:tcW w:type="dxa" w:w="1671"/>
+            <w:tcW w:type="dxa" w:w="1146"/>
             <w:vAlign w:val="center"/>
             <w:tcMar>
               <w:top w:w="80" w:type="dxa"/>
@@ -2898,15 +3385,13 @@
                 <w:color w:val="20201F"/>
                 <w:sz w:val="16"/>
               </w:rPr>
-              <w:t>HW/FW: Target revision not yet assigned</w:t>
-              <w:br/>
-              <w:t>Claim rev.: Target revision not yet assigned</w:t>
+              <w:t>Target revision not yet assigned</w:t>
             </w:r>
           </w:p>
         </w:tc>
         <w:tc>
           <w:tcPr>
-            <w:tcW w:type="dxa" w:w="1478"/>
+            <w:tcW w:type="dxa" w:w="1281"/>
             <w:vAlign w:val="center"/>
             <w:tcMar>
               <w:top w:w="80" w:type="dxa"/>
@@ -2927,14 +3412,12 @@
                 <w:sz w:val="16"/>
               </w:rPr>
               <w:t>PROTOCOL-01</w:t>
-              <w:br/>
-              <w:t>25 August 2026</w:t>
             </w:r>
           </w:p>
         </w:tc>
         <w:tc>
           <w:tcPr>
-            <w:tcW w:type="dxa" w:w="2698"/>
+            <w:tcW w:type="dxa" w:w="1011"/>
             <w:vAlign w:val="center"/>
             <w:tcMar>
               <w:top w:w="80" w:type="dxa"/>
@@ -2954,9 +3437,43 @@
                 <w:color w:val="20201F"/>
                 <w:sz w:val="16"/>
               </w:rPr>
-              <w:t>Co-locate ROOT with a traceable reference logger and report bias, mean absolute error, repeatability, sampling interval, stabilization time, and uncertainty.</w:t>
+              <w:t>25 August 2026</w:t>
+            </w:r>
+          </w:p>
+        </w:tc>
+        <w:tc>
+          <w:tcPr>
+            <w:tcW w:type="dxa" w:w="2763"/>
+            <w:vAlign w:val="center"/>
+            <w:tcMar>
+              <w:top w:w="80" w:type="dxa"/>
+              <w:bottom w:w="80" w:type="dxa"/>
+              <w:start w:w="120" w:type="dxa"/>
+              <w:end w:w="120" w:type="dxa"/>
+            </w:tcMar>
+          </w:tcPr>
+          <w:p>
+            <w:pPr>
+              <w:pStyle w:val="TableText"/>
+            </w:pPr>
+            <w:r>
+              <w:rPr>
+                <w:rFonts w:ascii="Arial" w:hAnsi="Arial" w:eastAsia="Arial" w:cs="Arial"/>
+                <w:b w:val="0"/>
+                <w:color w:val="20201F"/>
+                <w:sz w:val="16"/>
+              </w:rPr>
+              <w:t>Wording: Co-locate ROOT with a traceable reference logger and report bias, mean absolute error, repeatability, sampling interval, stabilization time, and uncertainty.</w:t>
               <w:br/>
-              <w:t>Owner: Haptique Electronics Pvt. Ltd. | Review: 25 August 2026</w:t>
+              <w:t>Owner: Haptique Electronics Pvt. Ltd.</w:t>
+              <w:br/>
+              <w:t>Review date: 25 August 2026</w:t>
+              <w:br/>
+              <w:t>Superseded wording: None recorded</w:t>
+              <w:br/>
+              <w:t>Hardware revision: Target revision not yet assigned</w:t>
+              <w:br/>
+              <w:t>Firmware revision: Target revision not yet assigned</w:t>
             </w:r>
           </w:p>
         </w:tc>
@@ -2967,7 +3484,7 @@
         </w:trPr>
         <w:tc>
           <w:tcPr>
-            <w:tcW w:type="dxa" w:w="771"/>
+            <w:tcW w:type="dxa" w:w="741"/>
             <w:vAlign w:val="center"/>
             <w:tcMar>
               <w:top w:w="80" w:type="dxa"/>
@@ -2993,7 +3510,7 @@
         </w:tc>
         <w:tc>
           <w:tcPr>
-            <w:tcW w:type="dxa" w:w="1478"/>
+            <w:tcW w:type="dxa" w:w="1348"/>
             <w:vAlign w:val="center"/>
             <w:tcMar>
               <w:top w:w="80" w:type="dxa"/>
@@ -3019,7 +3536,7 @@
         </w:tc>
         <w:tc>
           <w:tcPr>
-            <w:tcW w:type="dxa" w:w="1542"/>
+            <w:tcW w:type="dxa" w:w="1348"/>
             <w:vAlign w:val="center"/>
             <w:tcMar>
               <w:top w:w="80" w:type="dxa"/>
@@ -3045,7 +3562,7 @@
         </w:tc>
         <w:tc>
           <w:tcPr>
-            <w:tcW w:type="dxa" w:w="1671"/>
+            <w:tcW w:type="dxa" w:w="1146"/>
             <w:vAlign w:val="center"/>
             <w:tcMar>
               <w:top w:w="80" w:type="dxa"/>
@@ -3065,15 +3582,13 @@
                 <w:color w:val="20201F"/>
                 <w:sz w:val="16"/>
               </w:rPr>
-              <w:t>HW/FW: Target revision not yet assigned</w:t>
-              <w:br/>
-              <w:t>Claim rev.: Target revision not yet assigned</w:t>
+              <w:t>Target revision not yet assigned</w:t>
             </w:r>
           </w:p>
         </w:tc>
         <w:tc>
           <w:tcPr>
-            <w:tcW w:type="dxa" w:w="1478"/>
+            <w:tcW w:type="dxa" w:w="1281"/>
             <w:vAlign w:val="center"/>
             <w:tcMar>
               <w:top w:w="80" w:type="dxa"/>
@@ -3094,14 +3609,12 @@
                 <w:sz w:val="16"/>
               </w:rPr>
               <w:t>PROTOCOL-02</w:t>
-              <w:br/>
-              <w:t>25 August 2026</w:t>
             </w:r>
           </w:p>
         </w:tc>
         <w:tc>
           <w:tcPr>
-            <w:tcW w:type="dxa" w:w="2698"/>
+            <w:tcW w:type="dxa" w:w="1011"/>
             <w:vAlign w:val="center"/>
             <w:tcMar>
               <w:top w:w="80" w:type="dxa"/>
@@ -3121,9 +3634,43 @@
                 <w:color w:val="20201F"/>
                 <w:sz w:val="16"/>
               </w:rPr>
-              <w:t>Compare presence detections with timestamped ground truth across occupied, unoccupied, stationary, moving, obstructed, placement, and false-trigger scenarios.</w:t>
+              <w:t>25 August 2026</w:t>
+            </w:r>
+          </w:p>
+        </w:tc>
+        <w:tc>
+          <w:tcPr>
+            <w:tcW w:type="dxa" w:w="2763"/>
+            <w:vAlign w:val="center"/>
+            <w:tcMar>
+              <w:top w:w="80" w:type="dxa"/>
+              <w:bottom w:w="80" w:type="dxa"/>
+              <w:start w:w="120" w:type="dxa"/>
+              <w:end w:w="120" w:type="dxa"/>
+            </w:tcMar>
+          </w:tcPr>
+          <w:p>
+            <w:pPr>
+              <w:pStyle w:val="TableText"/>
+            </w:pPr>
+            <w:r>
+              <w:rPr>
+                <w:rFonts w:ascii="Arial" w:hAnsi="Arial" w:eastAsia="Arial" w:cs="Arial"/>
+                <w:b w:val="0"/>
+                <w:color w:val="20201F"/>
+                <w:sz w:val="16"/>
+              </w:rPr>
+              <w:t>Wording: Compare presence detections with timestamped ground truth across occupied, unoccupied, stationary, moving, obstructed, placement, and false-trigger scenarios.</w:t>
               <w:br/>
-              <w:t>Owner: Haptique Electronics Pvt. Ltd. | Review: 25 August 2026</w:t>
+              <w:t>Owner: Haptique Electronics Pvt. Ltd.</w:t>
+              <w:br/>
+              <w:t>Review date: 25 August 2026</w:t>
+              <w:br/>
+              <w:t>Superseded wording: None recorded</w:t>
+              <w:br/>
+              <w:t>Hardware revision: Target revision not yet assigned</w:t>
+              <w:br/>
+              <w:t>Firmware revision: Target revision not yet assigned</w:t>
             </w:r>
           </w:p>
         </w:tc>
@@ -3134,7 +3681,7 @@
         </w:trPr>
         <w:tc>
           <w:tcPr>
-            <w:tcW w:type="dxa" w:w="771"/>
+            <w:tcW w:type="dxa" w:w="741"/>
             <w:vAlign w:val="center"/>
             <w:tcMar>
               <w:top w:w="80" w:type="dxa"/>
@@ -3160,7 +3707,7 @@
         </w:tc>
         <w:tc>
           <w:tcPr>
-            <w:tcW w:type="dxa" w:w="1478"/>
+            <w:tcW w:type="dxa" w:w="1348"/>
             <w:vAlign w:val="center"/>
             <w:tcMar>
               <w:top w:w="80" w:type="dxa"/>
@@ -3186,7 +3733,7 @@
         </w:tc>
         <w:tc>
           <w:tcPr>
-            <w:tcW w:type="dxa" w:w="1542"/>
+            <w:tcW w:type="dxa" w:w="1348"/>
             <w:vAlign w:val="center"/>
             <w:tcMar>
               <w:top w:w="80" w:type="dxa"/>
@@ -3212,7 +3759,7 @@
         </w:tc>
         <w:tc>
           <w:tcPr>
-            <w:tcW w:type="dxa" w:w="1671"/>
+            <w:tcW w:type="dxa" w:w="1146"/>
             <w:vAlign w:val="center"/>
             <w:tcMar>
               <w:top w:w="80" w:type="dxa"/>
@@ -3232,15 +3779,13 @@
                 <w:color w:val="20201F"/>
                 <w:sz w:val="16"/>
               </w:rPr>
-              <w:t>HW/FW: Target revision not yet assigned</w:t>
-              <w:br/>
-              <w:t>Claim rev.: Target revision not yet assigned</w:t>
+              <w:t>Target revision not yet assigned</w:t>
             </w:r>
           </w:p>
         </w:tc>
         <w:tc>
           <w:tcPr>
-            <w:tcW w:type="dxa" w:w="1478"/>
+            <w:tcW w:type="dxa" w:w="1281"/>
             <w:vAlign w:val="center"/>
             <w:tcMar>
               <w:top w:w="80" w:type="dxa"/>
@@ -3261,14 +3806,12 @@
                 <w:sz w:val="16"/>
               </w:rPr>
               <w:t>PROTOCOL-03</w:t>
-              <w:br/>
-              <w:t>25 August 2026</w:t>
             </w:r>
           </w:p>
         </w:tc>
         <w:tc>
           <w:tcPr>
-            <w:tcW w:type="dxa" w:w="2698"/>
+            <w:tcW w:type="dxa" w:w="1011"/>
             <w:vAlign w:val="center"/>
             <w:tcMar>
               <w:top w:w="80" w:type="dxa"/>
@@ -3288,9 +3831,43 @@
                 <w:color w:val="20201F"/>
                 <w:sz w:val="16"/>
               </w:rPr>
-              <w:t>Test a declared stratified sample of AC brands, models, and commands over repeated trials, distances, angles, and line-of-sight conditions, reporting model-level successes and failures.</w:t>
+              <w:t>25 August 2026</w:t>
+            </w:r>
+          </w:p>
+        </w:tc>
+        <w:tc>
+          <w:tcPr>
+            <w:tcW w:type="dxa" w:w="2763"/>
+            <w:vAlign w:val="center"/>
+            <w:tcMar>
+              <w:top w:w="80" w:type="dxa"/>
+              <w:bottom w:w="80" w:type="dxa"/>
+              <w:start w:w="120" w:type="dxa"/>
+              <w:end w:w="120" w:type="dxa"/>
+            </w:tcMar>
+          </w:tcPr>
+          <w:p>
+            <w:pPr>
+              <w:pStyle w:val="TableText"/>
+            </w:pPr>
+            <w:r>
+              <w:rPr>
+                <w:rFonts w:ascii="Arial" w:hAnsi="Arial" w:eastAsia="Arial" w:cs="Arial"/>
+                <w:b w:val="0"/>
+                <w:color w:val="20201F"/>
+                <w:sz w:val="16"/>
+              </w:rPr>
+              <w:t>Wording: Test a declared stratified sample of AC brands, models, and commands over repeated trials, distances, angles, and line-of-sight conditions, reporting model-level successes and failures.</w:t>
               <w:br/>
-              <w:t>Owner: Haptique Electronics Pvt. Ltd. | Review: 25 August 2026</w:t>
+              <w:t>Owner: Haptique Electronics Pvt. Ltd.</w:t>
+              <w:br/>
+              <w:t>Review date: 25 August 2026</w:t>
+              <w:br/>
+              <w:t>Superseded wording: None recorded</w:t>
+              <w:br/>
+              <w:t>Hardware revision: Target revision not yet assigned</w:t>
+              <w:br/>
+              <w:t>Firmware revision: Target revision not yet assigned</w:t>
             </w:r>
           </w:p>
         </w:tc>
@@ -3301,7 +3878,7 @@
         </w:trPr>
         <w:tc>
           <w:tcPr>
-            <w:tcW w:type="dxa" w:w="771"/>
+            <w:tcW w:type="dxa" w:w="741"/>
             <w:vAlign w:val="center"/>
             <w:tcMar>
               <w:top w:w="80" w:type="dxa"/>
@@ -3327,7 +3904,7 @@
         </w:tc>
         <w:tc>
           <w:tcPr>
-            <w:tcW w:type="dxa" w:w="1478"/>
+            <w:tcW w:type="dxa" w:w="1348"/>
             <w:vAlign w:val="center"/>
             <w:tcMar>
               <w:top w:w="80" w:type="dxa"/>
@@ -3353,7 +3930,7 @@
         </w:tc>
         <w:tc>
           <w:tcPr>
-            <w:tcW w:type="dxa" w:w="1542"/>
+            <w:tcW w:type="dxa" w:w="1348"/>
             <w:vAlign w:val="center"/>
             <w:tcMar>
               <w:top w:w="80" w:type="dxa"/>
@@ -3379,7 +3956,7 @@
         </w:tc>
         <w:tc>
           <w:tcPr>
-            <w:tcW w:type="dxa" w:w="1671"/>
+            <w:tcW w:type="dxa" w:w="1146"/>
             <w:vAlign w:val="center"/>
             <w:tcMar>
               <w:top w:w="80" w:type="dxa"/>
@@ -3399,15 +3976,13 @@
                 <w:color w:val="20201F"/>
                 <w:sz w:val="16"/>
               </w:rPr>
-              <w:t>HW/FW: Target revision not yet assigned</w:t>
-              <w:br/>
-              <w:t>Claim rev.: Target revision not yet assigned</w:t>
+              <w:t>Target revision not yet assigned</w:t>
             </w:r>
           </w:p>
         </w:tc>
         <w:tc>
           <w:tcPr>
-            <w:tcW w:type="dxa" w:w="1478"/>
+            <w:tcW w:type="dxa" w:w="1281"/>
             <w:vAlign w:val="center"/>
             <w:tcMar>
               <w:top w:w="80" w:type="dxa"/>
@@ -3428,14 +4003,12 @@
                 <w:sz w:val="16"/>
               </w:rPr>
               <w:t>PROTOCOL-04</w:t>
-              <w:br/>
-              <w:t>25 August 2026</w:t>
             </w:r>
           </w:p>
         </w:tc>
         <w:tc>
           <w:tcPr>
-            <w:tcW w:type="dxa" w:w="2698"/>
+            <w:tcW w:type="dxa" w:w="1011"/>
             <w:vAlign w:val="center"/>
             <w:tcMar>
               <w:top w:w="80" w:type="dxa"/>
@@ -3455,9 +4028,43 @@
                 <w:color w:val="20201F"/>
                 <w:sz w:val="16"/>
               </w:rPr>
-              <w:t>Disable Wi-Fi and internet after setup, then exercise sensing, decisions, commands, reboot, and reconnection for a stated duration.</w:t>
+              <w:t>25 August 2026</w:t>
+            </w:r>
+          </w:p>
+        </w:tc>
+        <w:tc>
+          <w:tcPr>
+            <w:tcW w:type="dxa" w:w="2763"/>
+            <w:vAlign w:val="center"/>
+            <w:tcMar>
+              <w:top w:w="80" w:type="dxa"/>
+              <w:bottom w:w="80" w:type="dxa"/>
+              <w:start w:w="120" w:type="dxa"/>
+              <w:end w:w="120" w:type="dxa"/>
+            </w:tcMar>
+          </w:tcPr>
+          <w:p>
+            <w:pPr>
+              <w:pStyle w:val="TableText"/>
+            </w:pPr>
+            <w:r>
+              <w:rPr>
+                <w:rFonts w:ascii="Arial" w:hAnsi="Arial" w:eastAsia="Arial" w:cs="Arial"/>
+                <w:b w:val="0"/>
+                <w:color w:val="20201F"/>
+                <w:sz w:val="16"/>
+              </w:rPr>
+              <w:t>Wording: Disable Wi-Fi and internet after setup, then exercise sensing, decisions, commands, reboot, and reconnection for a stated duration.</w:t>
               <w:br/>
-              <w:t>Owner: Haptique Electronics Pvt. Ltd. | Review: 25 August 2026</w:t>
+              <w:t>Owner: Haptique Electronics Pvt. Ltd.</w:t>
+              <w:br/>
+              <w:t>Review date: 25 August 2026</w:t>
+              <w:br/>
+              <w:t>Superseded wording: None recorded</w:t>
+              <w:br/>
+              <w:t>Hardware revision: Target revision not yet assigned</w:t>
+              <w:br/>
+              <w:t>Firmware revision: Target revision not yet assigned</w:t>
             </w:r>
           </w:p>
         </w:tc>
@@ -3468,7 +4075,7 @@
         </w:trPr>
         <w:tc>
           <w:tcPr>
-            <w:tcW w:type="dxa" w:w="771"/>
+            <w:tcW w:type="dxa" w:w="741"/>
             <w:vAlign w:val="center"/>
             <w:tcMar>
               <w:top w:w="80" w:type="dxa"/>
@@ -3494,7 +4101,7 @@
         </w:tc>
         <w:tc>
           <w:tcPr>
-            <w:tcW w:type="dxa" w:w="1478"/>
+            <w:tcW w:type="dxa" w:w="1348"/>
             <w:vAlign w:val="center"/>
             <w:tcMar>
               <w:top w:w="80" w:type="dxa"/>
@@ -3520,7 +4127,7 @@
         </w:tc>
         <w:tc>
           <w:tcPr>
-            <w:tcW w:type="dxa" w:w="1542"/>
+            <w:tcW w:type="dxa" w:w="1348"/>
             <w:vAlign w:val="center"/>
             <w:tcMar>
               <w:top w:w="80" w:type="dxa"/>
@@ -3546,7 +4153,7 @@
         </w:tc>
         <w:tc>
           <w:tcPr>
-            <w:tcW w:type="dxa" w:w="1671"/>
+            <w:tcW w:type="dxa" w:w="1146"/>
             <w:vAlign w:val="center"/>
             <w:tcMar>
               <w:top w:w="80" w:type="dxa"/>
@@ -3566,15 +4173,13 @@
                 <w:color w:val="20201F"/>
                 <w:sz w:val="16"/>
               </w:rPr>
-              <w:t>HW/FW: Target revision not yet assigned</w:t>
-              <w:br/>
-              <w:t>Claim rev.: Target revision not yet assigned</w:t>
+              <w:t>Target revision not yet assigned</w:t>
             </w:r>
           </w:p>
         </w:tc>
         <w:tc>
           <w:tcPr>
-            <w:tcW w:type="dxa" w:w="1478"/>
+            <w:tcW w:type="dxa" w:w="1281"/>
             <w:vAlign w:val="center"/>
             <w:tcMar>
               <w:top w:w="80" w:type="dxa"/>
@@ -3595,14 +4200,12 @@
                 <w:sz w:val="16"/>
               </w:rPr>
               <w:t>PROTOCOL-05</w:t>
-              <w:br/>
-              <w:t>25 August 2026</w:t>
             </w:r>
           </w:p>
         </w:tc>
         <w:tc>
           <w:tcPr>
-            <w:tcW w:type="dxa" w:w="2698"/>
+            <w:tcW w:type="dxa" w:w="1011"/>
             <w:vAlign w:val="center"/>
             <w:tcMar>
               <w:top w:w="80" w:type="dxa"/>
@@ -3622,9 +4225,43 @@
                 <w:color w:val="20201F"/>
                 <w:sz w:val="16"/>
               </w:rPr>
-              <w:t>Observe first-time users completing a defined setup flow and report completion rate, timing distributions, assistance, retries, and failure reasons.</w:t>
+              <w:t>25 August 2026</w:t>
+            </w:r>
+          </w:p>
+        </w:tc>
+        <w:tc>
+          <w:tcPr>
+            <w:tcW w:type="dxa" w:w="2763"/>
+            <w:vAlign w:val="center"/>
+            <w:tcMar>
+              <w:top w:w="80" w:type="dxa"/>
+              <w:bottom w:w="80" w:type="dxa"/>
+              <w:start w:w="120" w:type="dxa"/>
+              <w:end w:w="120" w:type="dxa"/>
+            </w:tcMar>
+          </w:tcPr>
+          <w:p>
+            <w:pPr>
+              <w:pStyle w:val="TableText"/>
+            </w:pPr>
+            <w:r>
+              <w:rPr>
+                <w:rFonts w:ascii="Arial" w:hAnsi="Arial" w:eastAsia="Arial" w:cs="Arial"/>
+                <w:b w:val="0"/>
+                <w:color w:val="20201F"/>
+                <w:sz w:val="16"/>
+              </w:rPr>
+              <w:t>Wording: Observe first-time users completing a defined setup flow and report completion rate, timing distributions, assistance, retries, and failure reasons.</w:t>
               <w:br/>
-              <w:t>Owner: Haptique Electronics Pvt. Ltd. | Review: 25 August 2026</w:t>
+              <w:t>Owner: Haptique Electronics Pvt. Ltd.</w:t>
+              <w:br/>
+              <w:t>Review date: 25 August 2026</w:t>
+              <w:br/>
+              <w:t>Superseded wording: None recorded</w:t>
+              <w:br/>
+              <w:t>Hardware revision: Target revision not yet assigned</w:t>
+              <w:br/>
+              <w:t>Firmware revision: Target revision not yet assigned</w:t>
             </w:r>
           </w:p>
         </w:tc>
@@ -3635,7 +4272,7 @@
         </w:trPr>
         <w:tc>
           <w:tcPr>
-            <w:tcW w:type="dxa" w:w="771"/>
+            <w:tcW w:type="dxa" w:w="741"/>
             <w:vAlign w:val="center"/>
             <w:tcMar>
               <w:top w:w="80" w:type="dxa"/>
@@ -3661,7 +4298,7 @@
         </w:tc>
         <w:tc>
           <w:tcPr>
-            <w:tcW w:type="dxa" w:w="1478"/>
+            <w:tcW w:type="dxa" w:w="1348"/>
             <w:vAlign w:val="center"/>
             <w:tcMar>
               <w:top w:w="80" w:type="dxa"/>
@@ -3687,7 +4324,7 @@
         </w:tc>
         <w:tc>
           <w:tcPr>
-            <w:tcW w:type="dxa" w:w="1542"/>
+            <w:tcW w:type="dxa" w:w="1348"/>
             <w:vAlign w:val="center"/>
             <w:tcMar>
               <w:top w:w="80" w:type="dxa"/>
@@ -3713,7 +4350,7 @@
         </w:tc>
         <w:tc>
           <w:tcPr>
-            <w:tcW w:type="dxa" w:w="1671"/>
+            <w:tcW w:type="dxa" w:w="1146"/>
             <w:vAlign w:val="center"/>
             <w:tcMar>
               <w:top w:w="80" w:type="dxa"/>
@@ -3733,15 +4370,13 @@
                 <w:color w:val="20201F"/>
                 <w:sz w:val="16"/>
               </w:rPr>
-              <w:t>HW/FW: Target revision not yet assigned</w:t>
-              <w:br/>
-              <w:t>Claim rev.: Target revision not yet assigned</w:t>
+              <w:t>Target revision not yet assigned</w:t>
             </w:r>
           </w:p>
         </w:tc>
         <w:tc>
           <w:tcPr>
-            <w:tcW w:type="dxa" w:w="1478"/>
+            <w:tcW w:type="dxa" w:w="1281"/>
             <w:vAlign w:val="center"/>
             <w:tcMar>
               <w:top w:w="80" w:type="dxa"/>
@@ -3762,14 +4397,12 @@
                 <w:sz w:val="16"/>
               </w:rPr>
               <w:t>PROTOCOL-06</w:t>
-              <w:br/>
-              <w:t>25 August 2026</w:t>
             </w:r>
           </w:p>
         </w:tc>
         <w:tc>
           <w:tcPr>
-            <w:tcW w:type="dxa" w:w="2698"/>
+            <w:tcW w:type="dxa" w:w="1011"/>
             <w:vAlign w:val="center"/>
             <w:tcMar>
               <w:top w:w="80" w:type="dxa"/>
@@ -3789,9 +4422,43 @@
                 <w:color w:val="20201F"/>
                 <w:sz w:val="16"/>
               </w:rPr>
-              <w:t>Measure nominal and peak draw, supported input conditions, brownout and restart behavior, and recovery state using declared equipment.</w:t>
+              <w:t>25 August 2026</w:t>
+            </w:r>
+          </w:p>
+        </w:tc>
+        <w:tc>
+          <w:tcPr>
+            <w:tcW w:type="dxa" w:w="2763"/>
+            <w:vAlign w:val="center"/>
+            <w:tcMar>
+              <w:top w:w="80" w:type="dxa"/>
+              <w:bottom w:w="80" w:type="dxa"/>
+              <w:start w:w="120" w:type="dxa"/>
+              <w:end w:w="120" w:type="dxa"/>
+            </w:tcMar>
+          </w:tcPr>
+          <w:p>
+            <w:pPr>
+              <w:pStyle w:val="TableText"/>
+            </w:pPr>
+            <w:r>
+              <w:rPr>
+                <w:rFonts w:ascii="Arial" w:hAnsi="Arial" w:eastAsia="Arial" w:cs="Arial"/>
+                <w:b w:val="0"/>
+                <w:color w:val="20201F"/>
+                <w:sz w:val="16"/>
+              </w:rPr>
+              <w:t>Wording: Measure nominal and peak draw, supported input conditions, brownout and restart behavior, and recovery state using declared equipment.</w:t>
               <w:br/>
-              <w:t>Owner: Haptique Electronics Pvt. Ltd. | Review: 25 August 2026</w:t>
+              <w:t>Owner: Haptique Electronics Pvt. Ltd.</w:t>
+              <w:br/>
+              <w:t>Review date: 25 August 2026</w:t>
+              <w:br/>
+              <w:t>Superseded wording: None recorded</w:t>
+              <w:br/>
+              <w:t>Hardware revision: Target revision not yet assigned</w:t>
+              <w:br/>
+              <w:t>Firmware revision: Target revision not yet assigned</w:t>
             </w:r>
           </w:p>
         </w:tc>
@@ -3802,7 +4469,7 @@
         </w:trPr>
         <w:tc>
           <w:tcPr>
-            <w:tcW w:type="dxa" w:w="771"/>
+            <w:tcW w:type="dxa" w:w="741"/>
             <w:vAlign w:val="center"/>
             <w:tcMar>
               <w:top w:w="80" w:type="dxa"/>
@@ -3828,7 +4495,7 @@
         </w:tc>
         <w:tc>
           <w:tcPr>
-            <w:tcW w:type="dxa" w:w="1478"/>
+            <w:tcW w:type="dxa" w:w="1348"/>
             <w:vAlign w:val="center"/>
             <w:tcMar>
               <w:top w:w="80" w:type="dxa"/>
@@ -3854,7 +4521,7 @@
         </w:tc>
         <w:tc>
           <w:tcPr>
-            <w:tcW w:type="dxa" w:w="1542"/>
+            <w:tcW w:type="dxa" w:w="1348"/>
             <w:vAlign w:val="center"/>
             <w:tcMar>
               <w:top w:w="80" w:type="dxa"/>
@@ -3880,7 +4547,7 @@
         </w:tc>
         <w:tc>
           <w:tcPr>
-            <w:tcW w:type="dxa" w:w="1671"/>
+            <w:tcW w:type="dxa" w:w="1146"/>
             <w:vAlign w:val="center"/>
             <w:tcMar>
               <w:top w:w="80" w:type="dxa"/>
@@ -3900,15 +4567,13 @@
                 <w:color w:val="20201F"/>
                 <w:sz w:val="16"/>
               </w:rPr>
-              <w:t>HW/FW: Target revision not yet assigned</w:t>
-              <w:br/>
-              <w:t>Claim rev.: Target revision not yet assigned</w:t>
+              <w:t>Target revision not yet assigned</w:t>
             </w:r>
           </w:p>
         </w:tc>
         <w:tc>
           <w:tcPr>
-            <w:tcW w:type="dxa" w:w="1478"/>
+            <w:tcW w:type="dxa" w:w="1281"/>
             <w:vAlign w:val="center"/>
             <w:tcMar>
               <w:top w:w="80" w:type="dxa"/>
@@ -3929,14 +4594,12 @@
                 <w:sz w:val="16"/>
               </w:rPr>
               <w:t>PROTOCOL-07</w:t>
-              <w:br/>
-              <w:t>25 August 2026</w:t>
             </w:r>
           </w:p>
         </w:tc>
         <w:tc>
           <w:tcPr>
-            <w:tcW w:type="dxa" w:w="2698"/>
+            <w:tcW w:type="dxa" w:w="1011"/>
             <w:vAlign w:val="center"/>
             <w:tcMar>
               <w:top w:w="80" w:type="dxa"/>
@@ -3956,9 +4619,43 @@
                 <w:color w:val="20201F"/>
                 <w:sz w:val="16"/>
               </w:rPr>
-              <w:t>Use a randomized or counterbalanced baseline-versus-ROOT comparison with recorded conditions and predefined occupant-zone deviation, overshoot, cycling, and humidity outcomes.</w:t>
+              <w:t>25 August 2026</w:t>
+            </w:r>
+          </w:p>
+        </w:tc>
+        <w:tc>
+          <w:tcPr>
+            <w:tcW w:type="dxa" w:w="2763"/>
+            <w:vAlign w:val="center"/>
+            <w:tcMar>
+              <w:top w:w="80" w:type="dxa"/>
+              <w:bottom w:w="80" w:type="dxa"/>
+              <w:start w:w="120" w:type="dxa"/>
+              <w:end w:w="120" w:type="dxa"/>
+            </w:tcMar>
+          </w:tcPr>
+          <w:p>
+            <w:pPr>
+              <w:pStyle w:val="TableText"/>
+            </w:pPr>
+            <w:r>
+              <w:rPr>
+                <w:rFonts w:ascii="Arial" w:hAnsi="Arial" w:eastAsia="Arial" w:cs="Arial"/>
+                <w:b w:val="0"/>
+                <w:color w:val="20201F"/>
+                <w:sz w:val="16"/>
+              </w:rPr>
+              <w:t>Wording: Use a randomized or counterbalanced baseline-versus-ROOT comparison with recorded conditions and predefined occupant-zone deviation, overshoot, cycling, and humidity outcomes.</w:t>
               <w:br/>
-              <w:t>Owner: Haptique Electronics Pvt. Ltd. | Review: 25 August 2026</w:t>
+              <w:t>Owner: Haptique Electronics Pvt. Ltd.</w:t>
+              <w:br/>
+              <w:t>Review date: 25 August 2026</w:t>
+              <w:br/>
+              <w:t>Superseded wording: None recorded</w:t>
+              <w:br/>
+              <w:t>Hardware revision: Target revision not yet assigned</w:t>
+              <w:br/>
+              <w:t>Firmware revision: Target revision not yet assigned</w:t>
             </w:r>
           </w:p>
         </w:tc>
@@ -4077,12 +4774,17 @@
       </w:r>
     </w:p>
     <w:p>
+      <w:r>
+        <w:t>Planned evaluation IDs: PE-01, PE-02, PE-03, PE-04, PE-05, PE-06, and PE-07. Each acceptance rule will be pre-registered before testing; no threshold is approved in D0.1.</w:t>
+      </w:r>
+    </w:p>
+    <w:p>
       <w:pPr>
         <w:pStyle w:val="Caption"/>
         <w:keepNext/>
       </w:pPr>
       <w:r>
-        <w:t>Table 4. Planned evaluation protocol register.</w:t>
+        <w:t>Table 4. Planned evaluation matrix.</w:t>
       </w:r>
     </w:p>
     <w:tbl>
@@ -4102,11 +4804,11 @@
         </w:tblBorders>
       </w:tblPr>
       <w:tblGrid>
-        <w:gridCol w:w="1409"/>
+        <w:gridCol w:w="890"/>
         <w:gridCol w:w="1483"/>
-        <w:gridCol w:w="2076"/>
+        <w:gridCol w:w="3188"/>
+        <w:gridCol w:w="2298"/>
         <w:gridCol w:w="1779"/>
-        <w:gridCol w:w="2891"/>
       </w:tblGrid>
       <w:tr>
         <w:trPr>
@@ -4115,7 +4817,7 @@
         </w:trPr>
         <w:tc>
           <w:tcPr>
-            <w:tcW w:type="dxa" w:w="1409"/>
+            <w:tcW w:type="dxa" w:w="890"/>
             <w:vAlign w:val="center"/>
             <w:tcMar>
               <w:top w:w="80" w:type="dxa"/>
@@ -4136,7 +4838,7 @@
                 <w:color w:val="20201F"/>
                 <w:sz w:val="16"/>
               </w:rPr>
-              <w:t>Protocol</w:t>
+              <w:t>ID</w:t>
             </w:r>
           </w:p>
         </w:tc>
@@ -4163,13 +4865,13 @@
                 <w:color w:val="20201F"/>
                 <w:sz w:val="16"/>
               </w:rPr>
-              <w:t>Claim / title</w:t>
+              <w:t>Evaluation</w:t>
             </w:r>
           </w:p>
         </w:tc>
         <w:tc>
           <w:tcPr>
-            <w:tcW w:type="dxa" w:w="2076"/>
+            <w:tcW w:type="dxa" w:w="3188"/>
             <w:vAlign w:val="center"/>
             <w:tcMar>
               <w:top w:w="80" w:type="dxa"/>
@@ -4196,6 +4898,33 @@
         </w:tc>
         <w:tc>
           <w:tcPr>
+            <w:tcW w:type="dxa" w:w="2298"/>
+            <w:vAlign w:val="center"/>
+            <w:tcMar>
+              <w:top w:w="80" w:type="dxa"/>
+              <w:bottom w:w="80" w:type="dxa"/>
+              <w:start w:w="120" w:type="dxa"/>
+              <w:end w:w="120" w:type="dxa"/>
+            </w:tcMar>
+            <w:shd w:val="clear" w:color="auto" w:fill="F2F1ED"/>
+          </w:tcPr>
+          <w:p>
+            <w:pPr>
+              <w:pStyle w:val="TableText"/>
+            </w:pPr>
+            <w:r>
+              <w:rPr>
+                <w:rFonts w:ascii="Arial" w:hAnsi="Arial" w:eastAsia="Arial" w:cs="Arial"/>
+                <w:b/>
+                <w:color w:val="20201F"/>
+                <w:sz w:val="16"/>
+              </w:rPr>
+              <w:t>Primary outputs</w:t>
+            </w:r>
+          </w:p>
+        </w:tc>
+        <w:tc>
+          <w:tcPr>
             <w:tcW w:type="dxa" w:w="1779"/>
             <w:vAlign w:val="center"/>
             <w:tcMar>
@@ -4217,34 +4946,7 @@
                 <w:color w:val="20201F"/>
                 <w:sz w:val="16"/>
               </w:rPr>
-              <w:t>Outcomes</w:t>
-            </w:r>
-          </w:p>
-        </w:tc>
-        <w:tc>
-          <w:tcPr>
-            <w:tcW w:type="dxa" w:w="2891"/>
-            <w:vAlign w:val="center"/>
-            <w:tcMar>
-              <w:top w:w="80" w:type="dxa"/>
-              <w:bottom w:w="80" w:type="dxa"/>
-              <w:start w:w="120" w:type="dxa"/>
-              <w:end w:w="120" w:type="dxa"/>
-            </w:tcMar>
-            <w:shd w:val="clear" w:color="auto" w:fill="F2F1ED"/>
-          </w:tcPr>
-          <w:p>
-            <w:pPr>
-              <w:pStyle w:val="TableText"/>
-            </w:pPr>
-            <w:r>
-              <w:rPr>
-                <w:rFonts w:ascii="Arial" w:hAnsi="Arial" w:eastAsia="Arial" w:cs="Arial"/>
-                <w:b/>
-                <w:color w:val="20201F"/>
-                <w:sz w:val="16"/>
-              </w:rPr>
-              <w:t>Pre-registered planning contract</w:t>
+              <w:t>Acceptance rule</w:t>
             </w:r>
           </w:p>
         </w:tc>
@@ -4255,7 +4957,7 @@
         </w:trPr>
         <w:tc>
           <w:tcPr>
-            <w:tcW w:type="dxa" w:w="1409"/>
+            <w:tcW w:type="dxa" w:w="890"/>
             <w:vAlign w:val="center"/>
             <w:tcMar>
               <w:top w:w="80" w:type="dxa"/>
@@ -4275,7 +4977,7 @@
                 <w:color w:val="20201F"/>
                 <w:sz w:val="16"/>
               </w:rPr>
-              <w:t>PROTOCOL-01</w:t>
+              <w:t>PE-01</w:t>
             </w:r>
           </w:p>
         </w:tc>
@@ -4301,15 +5003,13 @@
                 <w:color w:val="20201F"/>
                 <w:sz w:val="16"/>
               </w:rPr>
-              <w:t>PE-01</w:t>
-              <w:br/>
               <w:t>Climate sensing</w:t>
             </w:r>
           </w:p>
         </w:tc>
         <w:tc>
           <w:tcPr>
-            <w:tcW w:type="dxa" w:w="2076"/>
+            <w:tcW w:type="dxa" w:w="3188"/>
             <w:vAlign w:val="center"/>
             <w:tcMar>
               <w:top w:w="80" w:type="dxa"/>
@@ -4337,6 +5037,32 @@
         </w:tc>
         <w:tc>
           <w:tcPr>
+            <w:tcW w:type="dxa" w:w="2298"/>
+            <w:vAlign w:val="center"/>
+            <w:tcMar>
+              <w:top w:w="80" w:type="dxa"/>
+              <w:bottom w:w="80" w:type="dxa"/>
+              <w:start w:w="120" w:type="dxa"/>
+              <w:end w:w="120" w:type="dxa"/>
+            </w:tcMar>
+          </w:tcPr>
+          <w:p>
+            <w:pPr>
+              <w:pStyle w:val="TableText"/>
+            </w:pPr>
+            <w:r>
+              <w:rPr>
+                <w:rFonts w:ascii="Arial" w:hAnsi="Arial" w:eastAsia="Arial" w:cs="Arial"/>
+                <w:b w:val="0"/>
+                <w:color w:val="20201F"/>
+                <w:sz w:val="16"/>
+              </w:rPr>
+              <w:t>bias; mean absolute error; repeatability; measurement uncertainty</w:t>
+            </w:r>
+          </w:p>
+        </w:tc>
+        <w:tc>
+          <w:tcPr>
             <w:tcW w:type="dxa" w:w="1779"/>
             <w:vAlign w:val="center"/>
             <w:tcMar>
@@ -4357,15 +5083,18 @@
                 <w:color w:val="20201F"/>
                 <w:sz w:val="16"/>
               </w:rPr>
-              <w:t>Primary: bias; mean absolute error; repeatability; measurement uncertainty</w:t>
-              <w:br/>
-              <w:t>Secondary: sampling interval; stabilization time</w:t>
+              <w:t>Pre-registered before testing</w:t>
             </w:r>
           </w:p>
         </w:tc>
+      </w:tr>
+      <w:tr>
+        <w:trPr>
+          <w:cantSplit/>
+        </w:trPr>
         <w:tc>
           <w:tcPr>
-            <w:tcW w:type="dxa" w:w="2891"/>
+            <w:tcW w:type="dxa" w:w="890"/>
             <w:vAlign w:val="center"/>
             <w:tcMar>
               <w:top w:w="80" w:type="dxa"/>
@@ -4385,46 +5114,7 @@
                 <w:color w:val="20201F"/>
                 <w:sz w:val="16"/>
               </w:rPr>
-              <w:t>Interval: Defined before testing | Trials: Defined before testing</w:t>
-              <w:br/>
-              <w:t>Acceptance: Defined before testing | Missing data: Defined before testing</w:t>
-              <w:br/>
-              <w:t>Uncertainty: Defined before testing | Artifact: Not yet assigned</w:t>
-              <w:br/>
-              <w:t>HW/FW: Target revision not yet assigned / Target revision not yet assigned</w:t>
-              <w:br/>
-              <w:t>Report: Trial counts, negative results, protocol deviations, raw and derived data location, and analysis version.</w:t>
-            </w:r>
-          </w:p>
-        </w:tc>
-      </w:tr>
-      <w:tr>
-        <w:trPr>
-          <w:cantSplit/>
-        </w:trPr>
-        <w:tc>
-          <w:tcPr>
-            <w:tcW w:type="dxa" w:w="1409"/>
-            <w:vAlign w:val="center"/>
-            <w:tcMar>
-              <w:top w:w="80" w:type="dxa"/>
-              <w:bottom w:w="80" w:type="dxa"/>
-              <w:start w:w="120" w:type="dxa"/>
-              <w:end w:w="120" w:type="dxa"/>
-            </w:tcMar>
-          </w:tcPr>
-          <w:p>
-            <w:pPr>
-              <w:pStyle w:val="TableText"/>
-            </w:pPr>
-            <w:r>
-              <w:rPr>
-                <w:rFonts w:ascii="Arial" w:hAnsi="Arial" w:eastAsia="Arial" w:cs="Arial"/>
-                <w:b w:val="0"/>
-                <w:color w:val="20201F"/>
-                <w:sz w:val="16"/>
-              </w:rPr>
-              <w:t>PROTOCOL-02</w:t>
+              <w:t>PE-02</w:t>
             </w:r>
           </w:p>
         </w:tc>
@@ -4450,15 +5140,13 @@
                 <w:color w:val="20201F"/>
                 <w:sz w:val="16"/>
               </w:rPr>
-              <w:t>PE-02</w:t>
-              <w:br/>
               <w:t>Presence sensing</w:t>
             </w:r>
           </w:p>
         </w:tc>
         <w:tc>
           <w:tcPr>
-            <w:tcW w:type="dxa" w:w="2076"/>
+            <w:tcW w:type="dxa" w:w="3188"/>
             <w:vAlign w:val="center"/>
             <w:tcMar>
               <w:top w:w="80" w:type="dxa"/>
@@ -4486,6 +5174,32 @@
         </w:tc>
         <w:tc>
           <w:tcPr>
+            <w:tcW w:type="dxa" w:w="2298"/>
+            <w:vAlign w:val="center"/>
+            <w:tcMar>
+              <w:top w:w="80" w:type="dxa"/>
+              <w:bottom w:w="80" w:type="dxa"/>
+              <w:start w:w="120" w:type="dxa"/>
+              <w:end w:w="120" w:type="dxa"/>
+            </w:tcMar>
+          </w:tcPr>
+          <w:p>
+            <w:pPr>
+              <w:pStyle w:val="TableText"/>
+            </w:pPr>
+            <w:r>
+              <w:rPr>
+                <w:rFonts w:ascii="Arial" w:hAnsi="Arial" w:eastAsia="Arial" w:cs="Arial"/>
+                <w:b w:val="0"/>
+                <w:color w:val="20201F"/>
+                <w:sz w:val="16"/>
+              </w:rPr>
+              <w:t>sensitivity; specificity or false-positive rate; response latency</w:t>
+            </w:r>
+          </w:p>
+        </w:tc>
+        <w:tc>
+          <w:tcPr>
             <w:tcW w:type="dxa" w:w="1779"/>
             <w:vAlign w:val="center"/>
             <w:tcMar>
@@ -4506,15 +5220,18 @@
                 <w:color w:val="20201F"/>
                 <w:sz w:val="16"/>
               </w:rPr>
-              <w:t>Primary: sensitivity; specificity or false-positive rate; response latency</w:t>
-              <w:br/>
-              <w:t>Secondary: false-trigger scenarios</w:t>
+              <w:t>Pre-registered before testing</w:t>
             </w:r>
           </w:p>
         </w:tc>
+      </w:tr>
+      <w:tr>
+        <w:trPr>
+          <w:cantSplit/>
+        </w:trPr>
         <w:tc>
           <w:tcPr>
-            <w:tcW w:type="dxa" w:w="2891"/>
+            <w:tcW w:type="dxa" w:w="890"/>
             <w:vAlign w:val="center"/>
             <w:tcMar>
               <w:top w:w="80" w:type="dxa"/>
@@ -4534,46 +5251,7 @@
                 <w:color w:val="20201F"/>
                 <w:sz w:val="16"/>
               </w:rPr>
-              <w:t>Interval: Defined before testing | Trials: Defined before testing</w:t>
-              <w:br/>
-              <w:t>Acceptance: Defined before testing | Missing data: Defined before testing</w:t>
-              <w:br/>
-              <w:t>Uncertainty: Defined before testing | Artifact: Not yet assigned</w:t>
-              <w:br/>
-              <w:t>HW/FW: Target revision not yet assigned / Target revision not yet assigned</w:t>
-              <w:br/>
-              <w:t>Report: Trial counts, negative results, protocol deviations, raw and derived data location, and analysis version.</w:t>
-            </w:r>
-          </w:p>
-        </w:tc>
-      </w:tr>
-      <w:tr>
-        <w:trPr>
-          <w:cantSplit/>
-        </w:trPr>
-        <w:tc>
-          <w:tcPr>
-            <w:tcW w:type="dxa" w:w="1409"/>
-            <w:vAlign w:val="center"/>
-            <w:tcMar>
-              <w:top w:w="80" w:type="dxa"/>
-              <w:bottom w:w="80" w:type="dxa"/>
-              <w:start w:w="120" w:type="dxa"/>
-              <w:end w:w="120" w:type="dxa"/>
-            </w:tcMar>
-          </w:tcPr>
-          <w:p>
-            <w:pPr>
-              <w:pStyle w:val="TableText"/>
-            </w:pPr>
-            <w:r>
-              <w:rPr>
-                <w:rFonts w:ascii="Arial" w:hAnsi="Arial" w:eastAsia="Arial" w:cs="Arial"/>
-                <w:b w:val="0"/>
-                <w:color w:val="20201F"/>
-                <w:sz w:val="16"/>
-              </w:rPr>
-              <w:t>PROTOCOL-03</w:t>
+              <w:t>PE-03</w:t>
             </w:r>
           </w:p>
         </w:tc>
@@ -4599,15 +5277,13 @@
                 <w:color w:val="20201F"/>
                 <w:sz w:val="16"/>
               </w:rPr>
-              <w:t>PE-03</w:t>
-              <w:br/>
               <w:t>IR interoperability</w:t>
             </w:r>
           </w:p>
         </w:tc>
         <w:tc>
           <w:tcPr>
-            <w:tcW w:type="dxa" w:w="2076"/>
+            <w:tcW w:type="dxa" w:w="3188"/>
             <w:vAlign w:val="center"/>
             <w:tcMar>
               <w:top w:w="80" w:type="dxa"/>
@@ -4635,6 +5311,32 @@
         </w:tc>
         <w:tc>
           <w:tcPr>
+            <w:tcW w:type="dxa" w:w="2298"/>
+            <w:vAlign w:val="center"/>
+            <w:tcMar>
+              <w:top w:w="80" w:type="dxa"/>
+              <w:bottom w:w="80" w:type="dxa"/>
+              <w:start w:w="120" w:type="dxa"/>
+              <w:end w:w="120" w:type="dxa"/>
+            </w:tcMar>
+          </w:tcPr>
+          <w:p>
+            <w:pPr>
+              <w:pStyle w:val="TableText"/>
+            </w:pPr>
+            <w:r>
+              <w:rPr>
+                <w:rFonts w:ascii="Arial" w:hAnsi="Arial" w:eastAsia="Arial" w:cs="Arial"/>
+                <w:b w:val="0"/>
+                <w:color w:val="20201F"/>
+                <w:sz w:val="16"/>
+              </w:rPr>
+              <w:t>model-level successes; model-level failures</w:t>
+            </w:r>
+          </w:p>
+        </w:tc>
+        <w:tc>
+          <w:tcPr>
             <w:tcW w:type="dxa" w:w="1779"/>
             <w:vAlign w:val="center"/>
             <w:tcMar>
@@ -4655,15 +5357,18 @@
                 <w:color w:val="20201F"/>
                 <w:sz w:val="16"/>
               </w:rPr>
-              <w:t>Primary: model-level successes; model-level failures</w:t>
-              <w:br/>
-              <w:t>Secondary: distance; angle; line-of-sight condition</w:t>
+              <w:t>Pre-registered before testing</w:t>
             </w:r>
           </w:p>
         </w:tc>
+      </w:tr>
+      <w:tr>
+        <w:trPr>
+          <w:cantSplit/>
+        </w:trPr>
         <w:tc>
           <w:tcPr>
-            <w:tcW w:type="dxa" w:w="2891"/>
+            <w:tcW w:type="dxa" w:w="890"/>
             <w:vAlign w:val="center"/>
             <w:tcMar>
               <w:top w:w="80" w:type="dxa"/>
@@ -4683,46 +5388,7 @@
                 <w:color w:val="20201F"/>
                 <w:sz w:val="16"/>
               </w:rPr>
-              <w:t>Interval: Defined before testing | Trials: Defined before testing</w:t>
-              <w:br/>
-              <w:t>Acceptance: Defined before testing | Missing data: Defined before testing</w:t>
-              <w:br/>
-              <w:t>Uncertainty: Defined before testing | Artifact: Not yet assigned</w:t>
-              <w:br/>
-              <w:t>HW/FW: Target revision not yet assigned / Target revision not yet assigned</w:t>
-              <w:br/>
-              <w:t>Report: Trial counts, negative results, protocol deviations, raw and derived data location, and analysis version.</w:t>
-            </w:r>
-          </w:p>
-        </w:tc>
-      </w:tr>
-      <w:tr>
-        <w:trPr>
-          <w:cantSplit/>
-        </w:trPr>
-        <w:tc>
-          <w:tcPr>
-            <w:tcW w:type="dxa" w:w="1409"/>
-            <w:vAlign w:val="center"/>
-            <w:tcMar>
-              <w:top w:w="80" w:type="dxa"/>
-              <w:bottom w:w="80" w:type="dxa"/>
-              <w:start w:w="120" w:type="dxa"/>
-              <w:end w:w="120" w:type="dxa"/>
-            </w:tcMar>
-          </w:tcPr>
-          <w:p>
-            <w:pPr>
-              <w:pStyle w:val="TableText"/>
-            </w:pPr>
-            <w:r>
-              <w:rPr>
-                <w:rFonts w:ascii="Arial" w:hAnsi="Arial" w:eastAsia="Arial" w:cs="Arial"/>
-                <w:b w:val="0"/>
-                <w:color w:val="20201F"/>
-                <w:sz w:val="16"/>
-              </w:rPr>
-              <w:t>PROTOCOL-04</w:t>
+              <w:t>PE-04</w:t>
             </w:r>
           </w:p>
         </w:tc>
@@ -4748,15 +5414,13 @@
                 <w:color w:val="20201F"/>
                 <w:sz w:val="16"/>
               </w:rPr>
-              <w:t>PE-04</w:t>
-              <w:br/>
               <w:t>Offline control</w:t>
             </w:r>
           </w:p>
         </w:tc>
         <w:tc>
           <w:tcPr>
-            <w:tcW w:type="dxa" w:w="2076"/>
+            <w:tcW w:type="dxa" w:w="3188"/>
             <w:vAlign w:val="center"/>
             <w:tcMar>
               <w:top w:w="80" w:type="dxa"/>
@@ -4784,6 +5448,32 @@
         </w:tc>
         <w:tc>
           <w:tcPr>
+            <w:tcW w:type="dxa" w:w="2298"/>
+            <w:vAlign w:val="center"/>
+            <w:tcMar>
+              <w:top w:w="80" w:type="dxa"/>
+              <w:bottom w:w="80" w:type="dxa"/>
+              <w:start w:w="120" w:type="dxa"/>
+              <w:end w:w="120" w:type="dxa"/>
+            </w:tcMar>
+          </w:tcPr>
+          <w:p>
+            <w:pPr>
+              <w:pStyle w:val="TableText"/>
+            </w:pPr>
+            <w:r>
+              <w:rPr>
+                <w:rFonts w:ascii="Arial" w:hAnsi="Arial" w:eastAsia="Arial" w:cs="Arial"/>
+                <w:b w:val="0"/>
+                <w:color w:val="20201F"/>
+                <w:sz w:val="16"/>
+              </w:rPr>
+              <w:t>sensing, decision, command, reboot, and reconnection behavior</w:t>
+            </w:r>
+          </w:p>
+        </w:tc>
+        <w:tc>
+          <w:tcPr>
             <w:tcW w:type="dxa" w:w="1779"/>
             <w:vAlign w:val="center"/>
             <w:tcMar>
@@ -4804,15 +5494,18 @@
                 <w:color w:val="20201F"/>
                 <w:sz w:val="16"/>
               </w:rPr>
-              <w:t>Primary: sensing, decision, command, reboot, and reconnection behavior</w:t>
-              <w:br/>
-              <w:t>Secondary: network independence distinct from electrical uptime</w:t>
+              <w:t>Pre-registered before testing</w:t>
             </w:r>
           </w:p>
         </w:tc>
+      </w:tr>
+      <w:tr>
+        <w:trPr>
+          <w:cantSplit/>
+        </w:trPr>
         <w:tc>
           <w:tcPr>
-            <w:tcW w:type="dxa" w:w="2891"/>
+            <w:tcW w:type="dxa" w:w="890"/>
             <w:vAlign w:val="center"/>
             <w:tcMar>
               <w:top w:w="80" w:type="dxa"/>
@@ -4832,46 +5525,7 @@
                 <w:color w:val="20201F"/>
                 <w:sz w:val="16"/>
               </w:rPr>
-              <w:t>Interval: Defined before testing | Trials: Defined before testing</w:t>
-              <w:br/>
-              <w:t>Acceptance: Defined before testing | Missing data: Defined before testing</w:t>
-              <w:br/>
-              <w:t>Uncertainty: Defined before testing | Artifact: Not yet assigned</w:t>
-              <w:br/>
-              <w:t>HW/FW: Target revision not yet assigned / Target revision not yet assigned</w:t>
-              <w:br/>
-              <w:t>Report: Trial counts, negative results, protocol deviations, raw and derived data location, and analysis version.</w:t>
-            </w:r>
-          </w:p>
-        </w:tc>
-      </w:tr>
-      <w:tr>
-        <w:trPr>
-          <w:cantSplit/>
-        </w:trPr>
-        <w:tc>
-          <w:tcPr>
-            <w:tcW w:type="dxa" w:w="1409"/>
-            <w:vAlign w:val="center"/>
-            <w:tcMar>
-              <w:top w:w="80" w:type="dxa"/>
-              <w:bottom w:w="80" w:type="dxa"/>
-              <w:start w:w="120" w:type="dxa"/>
-              <w:end w:w="120" w:type="dxa"/>
-            </w:tcMar>
-          </w:tcPr>
-          <w:p>
-            <w:pPr>
-              <w:pStyle w:val="TableText"/>
-            </w:pPr>
-            <w:r>
-              <w:rPr>
-                <w:rFonts w:ascii="Arial" w:hAnsi="Arial" w:eastAsia="Arial" w:cs="Arial"/>
-                <w:b w:val="0"/>
-                <w:color w:val="20201F"/>
-                <w:sz w:val="16"/>
-              </w:rPr>
-              <w:t>PROTOCOL-05</w:t>
+              <w:t>PE-05</w:t>
             </w:r>
           </w:p>
         </w:tc>
@@ -4897,15 +5551,13 @@
                 <w:color w:val="20201F"/>
                 <w:sz w:val="16"/>
               </w:rPr>
-              <w:t>PE-05</w:t>
-              <w:br/>
               <w:t>Setup</w:t>
             </w:r>
           </w:p>
         </w:tc>
         <w:tc>
           <w:tcPr>
-            <w:tcW w:type="dxa" w:w="2076"/>
+            <w:tcW w:type="dxa" w:w="3188"/>
             <w:vAlign w:val="center"/>
             <w:tcMar>
               <w:top w:w="80" w:type="dxa"/>
@@ -4933,6 +5585,32 @@
         </w:tc>
         <w:tc>
           <w:tcPr>
+            <w:tcW w:type="dxa" w:w="2298"/>
+            <w:vAlign w:val="center"/>
+            <w:tcMar>
+              <w:top w:w="80" w:type="dxa"/>
+              <w:bottom w:w="80" w:type="dxa"/>
+              <w:start w:w="120" w:type="dxa"/>
+              <w:end w:w="120" w:type="dxa"/>
+            </w:tcMar>
+          </w:tcPr>
+          <w:p>
+            <w:pPr>
+              <w:pStyle w:val="TableText"/>
+            </w:pPr>
+            <w:r>
+              <w:rPr>
+                <w:rFonts w:ascii="Arial" w:hAnsi="Arial" w:eastAsia="Arial" w:cs="Arial"/>
+                <w:b w:val="0"/>
+                <w:color w:val="20201F"/>
+                <w:sz w:val="16"/>
+              </w:rPr>
+              <w:t>completion rate; median and range or interquartile range</w:t>
+            </w:r>
+          </w:p>
+        </w:tc>
+        <w:tc>
+          <w:tcPr>
             <w:tcW w:type="dxa" w:w="1779"/>
             <w:vAlign w:val="center"/>
             <w:tcMar>
@@ -4953,15 +5631,18 @@
                 <w:color w:val="20201F"/>
                 <w:sz w:val="16"/>
               </w:rPr>
-              <w:t>Primary: completion rate; median and range or interquartile range</w:t>
-              <w:br/>
-              <w:t>Secondary: assistance; retries; failure reasons</w:t>
+              <w:t>Pre-registered before testing</w:t>
             </w:r>
           </w:p>
         </w:tc>
+      </w:tr>
+      <w:tr>
+        <w:trPr>
+          <w:cantSplit/>
+        </w:trPr>
         <w:tc>
           <w:tcPr>
-            <w:tcW w:type="dxa" w:w="2891"/>
+            <w:tcW w:type="dxa" w:w="890"/>
             <w:vAlign w:val="center"/>
             <w:tcMar>
               <w:top w:w="80" w:type="dxa"/>
@@ -4981,46 +5662,7 @@
                 <w:color w:val="20201F"/>
                 <w:sz w:val="16"/>
               </w:rPr>
-              <w:t>Interval: Defined before testing | Trials: Defined before testing</w:t>
-              <w:br/>
-              <w:t>Acceptance: Defined before testing | Missing data: Defined before testing</w:t>
-              <w:br/>
-              <w:t>Uncertainty: Defined before testing | Artifact: Not yet assigned</w:t>
-              <w:br/>
-              <w:t>HW/FW: Target revision not yet assigned / Target revision not yet assigned</w:t>
-              <w:br/>
-              <w:t>Report: Trial counts, negative results, protocol deviations, raw and derived data location, and analysis version.</w:t>
-            </w:r>
-          </w:p>
-        </w:tc>
-      </w:tr>
-      <w:tr>
-        <w:trPr>
-          <w:cantSplit/>
-        </w:trPr>
-        <w:tc>
-          <w:tcPr>
-            <w:tcW w:type="dxa" w:w="1409"/>
-            <w:vAlign w:val="center"/>
-            <w:tcMar>
-              <w:top w:w="80" w:type="dxa"/>
-              <w:bottom w:w="80" w:type="dxa"/>
-              <w:start w:w="120" w:type="dxa"/>
-              <w:end w:w="120" w:type="dxa"/>
-            </w:tcMar>
-          </w:tcPr>
-          <w:p>
-            <w:pPr>
-              <w:pStyle w:val="TableText"/>
-            </w:pPr>
-            <w:r>
-              <w:rPr>
-                <w:rFonts w:ascii="Arial" w:hAnsi="Arial" w:eastAsia="Arial" w:cs="Arial"/>
-                <w:b w:val="0"/>
-                <w:color w:val="20201F"/>
-                <w:sz w:val="16"/>
-              </w:rPr>
-              <w:t>PROTOCOL-06</w:t>
+              <w:t>PE-06</w:t>
             </w:r>
           </w:p>
         </w:tc>
@@ -5046,15 +5688,13 @@
                 <w:color w:val="20201F"/>
                 <w:sz w:val="16"/>
               </w:rPr>
-              <w:t>PE-06</w:t>
-              <w:br/>
               <w:t>Power behavior</w:t>
             </w:r>
           </w:p>
         </w:tc>
         <w:tc>
           <w:tcPr>
-            <w:tcW w:type="dxa" w:w="2076"/>
+            <w:tcW w:type="dxa" w:w="3188"/>
             <w:vAlign w:val="center"/>
             <w:tcMar>
               <w:top w:w="80" w:type="dxa"/>
@@ -5082,6 +5722,32 @@
         </w:tc>
         <w:tc>
           <w:tcPr>
+            <w:tcW w:type="dxa" w:w="2298"/>
+            <w:vAlign w:val="center"/>
+            <w:tcMar>
+              <w:top w:w="80" w:type="dxa"/>
+              <w:bottom w:w="80" w:type="dxa"/>
+              <w:start w:w="120" w:type="dxa"/>
+              <w:end w:w="120" w:type="dxa"/>
+            </w:tcMar>
+          </w:tcPr>
+          <w:p>
+            <w:pPr>
+              <w:pStyle w:val="TableText"/>
+            </w:pPr>
+            <w:r>
+              <w:rPr>
+                <w:rFonts w:ascii="Arial" w:hAnsi="Arial" w:eastAsia="Arial" w:cs="Arial"/>
+                <w:b w:val="0"/>
+                <w:color w:val="20201F"/>
+                <w:sz w:val="16"/>
+              </w:rPr>
+              <w:t>nominal draw; peak draw; brownout and restart behavior</w:t>
+            </w:r>
+          </w:p>
+        </w:tc>
+        <w:tc>
+          <w:tcPr>
             <w:tcW w:type="dxa" w:w="1779"/>
             <w:vAlign w:val="center"/>
             <w:tcMar>
@@ -5102,15 +5768,18 @@
                 <w:color w:val="20201F"/>
                 <w:sz w:val="16"/>
               </w:rPr>
-              <w:t>Primary: nominal draw; peak draw; brownout and restart behavior</w:t>
-              <w:br/>
-              <w:t>Secondary: recovery state</w:t>
+              <w:t>Pre-registered before testing</w:t>
             </w:r>
           </w:p>
         </w:tc>
+      </w:tr>
+      <w:tr>
+        <w:trPr>
+          <w:cantSplit/>
+        </w:trPr>
         <w:tc>
           <w:tcPr>
-            <w:tcW w:type="dxa" w:w="2891"/>
+            <w:tcW w:type="dxa" w:w="890"/>
             <w:vAlign w:val="center"/>
             <w:tcMar>
               <w:top w:w="80" w:type="dxa"/>
@@ -5130,46 +5799,7 @@
                 <w:color w:val="20201F"/>
                 <w:sz w:val="16"/>
               </w:rPr>
-              <w:t>Interval: Defined before testing | Trials: Defined before testing</w:t>
-              <w:br/>
-              <w:t>Acceptance: Defined before testing | Missing data: Defined before testing</w:t>
-              <w:br/>
-              <w:t>Uncertainty: Defined before testing | Artifact: Not yet assigned</w:t>
-              <w:br/>
-              <w:t>HW/FW: Target revision not yet assigned / Target revision not yet assigned</w:t>
-              <w:br/>
-              <w:t>Report: Trial counts, negative results, protocol deviations, raw and derived data location, and analysis version.</w:t>
-            </w:r>
-          </w:p>
-        </w:tc>
-      </w:tr>
-      <w:tr>
-        <w:trPr>
-          <w:cantSplit/>
-        </w:trPr>
-        <w:tc>
-          <w:tcPr>
-            <w:tcW w:type="dxa" w:w="1409"/>
-            <w:vAlign w:val="center"/>
-            <w:tcMar>
-              <w:top w:w="80" w:type="dxa"/>
-              <w:bottom w:w="80" w:type="dxa"/>
-              <w:start w:w="120" w:type="dxa"/>
-              <w:end w:w="120" w:type="dxa"/>
-            </w:tcMar>
-          </w:tcPr>
-          <w:p>
-            <w:pPr>
-              <w:pStyle w:val="TableText"/>
-            </w:pPr>
-            <w:r>
-              <w:rPr>
-                <w:rFonts w:ascii="Arial" w:hAnsi="Arial" w:eastAsia="Arial" w:cs="Arial"/>
-                <w:b w:val="0"/>
-                <w:color w:val="20201F"/>
-                <w:sz w:val="16"/>
-              </w:rPr>
-              <w:t>PROTOCOL-07</w:t>
+              <w:t>PE-07</w:t>
             </w:r>
           </w:p>
         </w:tc>
@@ -5195,15 +5825,13 @@
                 <w:color w:val="20201F"/>
                 <w:sz w:val="16"/>
               </w:rPr>
-              <w:t>PE-07</w:t>
-              <w:br/>
               <w:t>Room comfort stability</w:t>
             </w:r>
           </w:p>
         </w:tc>
         <w:tc>
           <w:tcPr>
-            <w:tcW w:type="dxa" w:w="2076"/>
+            <w:tcW w:type="dxa" w:w="3188"/>
             <w:vAlign w:val="center"/>
             <w:tcMar>
               <w:top w:w="80" w:type="dxa"/>
@@ -5231,6 +5859,32 @@
         </w:tc>
         <w:tc>
           <w:tcPr>
+            <w:tcW w:type="dxa" w:w="2298"/>
+            <w:vAlign w:val="center"/>
+            <w:tcMar>
+              <w:top w:w="80" w:type="dxa"/>
+              <w:bottom w:w="80" w:type="dxa"/>
+              <w:start w:w="120" w:type="dxa"/>
+              <w:end w:w="120" w:type="dxa"/>
+            </w:tcMar>
+          </w:tcPr>
+          <w:p>
+            <w:pPr>
+              <w:pStyle w:val="TableText"/>
+            </w:pPr>
+            <w:r>
+              <w:rPr>
+                <w:rFonts w:ascii="Arial" w:hAnsi="Arial" w:eastAsia="Arial" w:cs="Arial"/>
+                <w:b w:val="0"/>
+                <w:color w:val="20201F"/>
+                <w:sz w:val="16"/>
+              </w:rPr>
+              <w:t>occupant-zone deviation; overshoot; cycling; humidity</w:t>
+            </w:r>
+          </w:p>
+        </w:tc>
+        <w:tc>
+          <w:tcPr>
             <w:tcW w:type="dxa" w:w="1779"/>
             <w:vAlign w:val="center"/>
             <w:tcMar>
@@ -5251,43 +5905,7 @@
                 <w:color w:val="20201F"/>
                 <w:sz w:val="16"/>
               </w:rPr>
-              <w:t>Primary: occupant-zone deviation; overshoot; cycling; humidity</w:t>
-              <w:br/>
-              <w:t>Secondary: recorded room and operating conditions</w:t>
-            </w:r>
-          </w:p>
-        </w:tc>
-        <w:tc>
-          <w:tcPr>
-            <w:tcW w:type="dxa" w:w="2891"/>
-            <w:vAlign w:val="center"/>
-            <w:tcMar>
-              <w:top w:w="80" w:type="dxa"/>
-              <w:bottom w:w="80" w:type="dxa"/>
-              <w:start w:w="120" w:type="dxa"/>
-              <w:end w:w="120" w:type="dxa"/>
-            </w:tcMar>
-          </w:tcPr>
-          <w:p>
-            <w:pPr>
-              <w:pStyle w:val="TableText"/>
-            </w:pPr>
-            <w:r>
-              <w:rPr>
-                <w:rFonts w:ascii="Arial" w:hAnsi="Arial" w:eastAsia="Arial" w:cs="Arial"/>
-                <w:b w:val="0"/>
-                <w:color w:val="20201F"/>
-                <w:sz w:val="16"/>
-              </w:rPr>
-              <w:t>Interval: Defined before testing | Trials: Defined before testing</w:t>
-              <w:br/>
-              <w:t>Acceptance: Defined before testing | Missing data: Defined before testing</w:t>
-              <w:br/>
-              <w:t>Uncertainty: Defined before testing | Artifact: Not yet assigned</w:t>
-              <w:br/>
-              <w:t>HW/FW: Target revision not yet assigned / Target revision not yet assigned</w:t>
-              <w:br/>
-              <w:t>Report: Trial counts, negative results, protocol deviations, raw and derived data location, and analysis version.</w:t>
+              <w:t>Pre-registered before testing</w:t>
             </w:r>
           </w:p>
         </w:tc>

</xml_diff>

<commit_message>
feat: export verified ROOT technical paper PDF
</commit_message>
<xml_diff>
--- a/output/docx/ROOT-Technical-Concept-Paper-D0.1.docx
+++ b/output/docx/ROOT-Technical-Concept-Paper-D0.1.docx
@@ -779,7 +779,7 @@
         <w:spacing w:before="360" w:after="160"/>
       </w:pPr>
       <w:r>
-        <w:t>Contents</w:t>
+        <w:t>Table of contents</w:t>
       </w:r>
     </w:p>
     <w:p>
@@ -803,6 +803,10 @@
       <w:r>
         <w:t>1. The room-level problem</w:t>
       </w:r>
+      <w:r>
+        <w:tab/>
+        <w:t>4</w:t>
+      </w:r>
     </w:p>
     <w:p>
       <w:pPr>
@@ -813,6 +817,10 @@
       </w:pPr>
       <w:r>
         <w:t>2. System architecture</w:t>
+      </w:r>
+      <w:r>
+        <w:tab/>
+        <w:t>4</w:t>
       </w:r>
     </w:p>
     <w:p>
@@ -825,6 +833,10 @@
       <w:r>
         <w:t>3. Connectivity and local-control boundary</w:t>
       </w:r>
+      <w:r>
+        <w:tab/>
+        <w:t>5</w:t>
+      </w:r>
     </w:p>
     <w:p>
       <w:pPr>
@@ -835,6 +847,10 @@
       </w:pPr>
       <w:r>
         <w:t>4. Sensing and infrared interface</w:t>
+      </w:r>
+      <w:r>
+        <w:tab/>
+        <w:t>5</w:t>
       </w:r>
     </w:p>
     <w:p>
@@ -847,6 +863,10 @@
       <w:r>
         <w:t>5. Placement and installation boundary</w:t>
       </w:r>
+      <w:r>
+        <w:tab/>
+        <w:t>6</w:t>
+      </w:r>
     </w:p>
     <w:p>
       <w:pPr>
@@ -857,6 +877,10 @@
       </w:pPr>
       <w:r>
         <w:t>6. Claim and evidence register</w:t>
+      </w:r>
+      <w:r>
+        <w:tab/>
+        <w:t>6</w:t>
       </w:r>
     </w:p>
     <w:p>
@@ -869,6 +893,10 @@
       <w:r>
         <w:t>7. Evaluation methodology</w:t>
       </w:r>
+      <w:r>
+        <w:tab/>
+        <w:t>9</w:t>
+      </w:r>
     </w:p>
     <w:p>
       <w:pPr>
@@ -880,6 +908,10 @@
       <w:r>
         <w:t>8. Limitations, privacy, and safety boundary</w:t>
       </w:r>
+      <w:r>
+        <w:tab/>
+        <w:t>10</w:t>
+      </w:r>
     </w:p>
     <w:p>
       <w:pPr>
@@ -890,6 +922,10 @@
       </w:pPr>
       <w:r>
         <w:t>9. Company and document position</w:t>
+      </w:r>
+      <w:r>
+        <w:tab/>
+        <w:t>10</w:t>
       </w:r>
     </w:p>
     <w:p>
@@ -923,6 +959,10 @@
       </w:pPr>
       <w:r>
         <w:t>Appendix A. Controlled disclosures</w:t>
+      </w:r>
+      <w:r>
+        <w:tab/>
+        <w:t>12</w:t>
       </w:r>
     </w:p>
     <w:p>

</xml_diff>

<commit_message>
fix: complete technical paper publication contract
</commit_message>
<xml_diff>
--- a/output/docx/ROOT-Technical-Concept-Paper-D0.1.docx
+++ b/output/docx/ROOT-Technical-Concept-Paper-D0.1.docx
@@ -71,7 +71,7 @@
           <w:color w:val="676761"/>
           <w:sz w:val="18"/>
         </w:rPr>
-        <w:t>Developer preview  |  Issued 25 August 2026</w:t>
+        <w:t>Developer preview  |  Issued: 25 August 2026</w:t>
       </w:r>
     </w:p>
     <w:p>
@@ -84,7 +84,20 @@
           <w:color w:val="676761"/>
           <w:sz w:val="18"/>
         </w:rPr>
-        <w:t>Haptique Electronics Pvt. Ltd.</w:t>
+        <w:t>Owner: Haptique Electronics Pvt. Ltd.</w:t>
+      </w:r>
+    </w:p>
+    <w:p>
+      <w:pPr>
+        <w:spacing w:before="0"/>
+      </w:pPr>
+      <w:r>
+        <w:rPr>
+          <w:rFonts w:ascii="Arial" w:hAnsi="Arial" w:eastAsia="Arial" w:cs="Arial"/>
+          <w:color w:val="676761"/>
+          <w:sz w:val="18"/>
+        </w:rPr>
+        <w:t>Technical reviewer: Not yet assigned  |  Evidence cutoff: 25 August 2026</w:t>
       </w:r>
     </w:p>
     <w:p>
@@ -910,7 +923,7 @@
       </w:r>
       <w:r>
         <w:tab/>
-        <w:t>10</w:t>
+        <w:t>11</w:t>
       </w:r>
     </w:p>
     <w:p>
@@ -925,7 +938,7 @@
       </w:r>
       <w:r>
         <w:tab/>
-        <w:t>10</w:t>
+        <w:t>11</w:t>
       </w:r>
     </w:p>
     <w:p>
@@ -962,7 +975,7 @@
       </w:r>
       <w:r>
         <w:tab/>
-        <w:t>12</w:t>
+        <w:t>13</w:t>
       </w:r>
     </w:p>
     <w:p>
@@ -1557,7 +1570,12 @@
     </w:p>
     <w:p>
       <w:r>
-        <w:t>This paper describes the intended architecture, its control and privacy boundaries, and the evaluation methods required before product-performance statements can be made. It reports no measured product-performance result. All unmeasured ROOT behavior is classified as a hypothesis, design target, or planned evaluation.</w:t>
+        <w:t>The paper limits its scope to an engineering concept: proposed climate and presence inputs, Bluetooth-assisted configuration, infrared learning and transmission, placement effects, on-device decision boundaries, and failure modes that must preserve manual AC control. It distinguishes cited HVAC context from ROOT-specific hypotheses and records the hardware and firmware revisions to which future evidence must apply.</w:t>
+      </w:r>
+    </w:p>
+    <w:p>
+      <w:r>
+        <w:t>Seven planned evaluations define how climate sensing, presence sensing, infrared interoperability, offline control, setup, power behavior, and room-comfort stability are to be tested. Each protocol requires stated conditions, comparators, sampling, repeated trials, outcomes, pre-specified acceptance criteria, missing-data handling, uncertainty, and retained artifacts. This revision reports no measured product-performance result, establishes no compatibility, accuracy, reliability, comfort, or energy claim, and treats every unmeasured behavior as a hypothesis, design target, or planned evaluation.</w:t>
       </w:r>
     </w:p>
     <w:p>
@@ -4824,7 +4842,7 @@
         <w:keepNext/>
       </w:pPr>
       <w:r>
-        <w:t>Table 4. Planned evaluation matrix.</w:t>
+        <w:t>Table 4. Planned evaluation protocol register.</w:t>
       </w:r>
     </w:p>
     <w:tbl>
@@ -4844,11 +4862,9 @@
         </w:tblBorders>
       </w:tblPr>
       <w:tblGrid>
-        <w:gridCol w:w="890"/>
-        <w:gridCol w:w="1483"/>
-        <w:gridCol w:w="3188"/>
-        <w:gridCol w:w="2298"/>
-        <w:gridCol w:w="1779"/>
+        <w:gridCol w:w="1417"/>
+        <w:gridCol w:w="3969"/>
+        <w:gridCol w:w="4252"/>
       </w:tblGrid>
       <w:tr>
         <w:trPr>
@@ -4857,34 +4873,7 @@
         </w:trPr>
         <w:tc>
           <w:tcPr>
-            <w:tcW w:type="dxa" w:w="890"/>
-            <w:vAlign w:val="center"/>
-            <w:tcMar>
-              <w:top w:w="80" w:type="dxa"/>
-              <w:bottom w:w="80" w:type="dxa"/>
-              <w:start w:w="120" w:type="dxa"/>
-              <w:end w:w="120" w:type="dxa"/>
-            </w:tcMar>
-            <w:shd w:val="clear" w:color="auto" w:fill="F2F1ED"/>
-          </w:tcPr>
-          <w:p>
-            <w:pPr>
-              <w:pStyle w:val="TableText"/>
-            </w:pPr>
-            <w:r>
-              <w:rPr>
-                <w:rFonts w:ascii="Arial" w:hAnsi="Arial" w:eastAsia="Arial" w:cs="Arial"/>
-                <w:b/>
-                <w:color w:val="20201F"/>
-                <w:sz w:val="16"/>
-              </w:rPr>
-              <w:t>ID</w:t>
-            </w:r>
-          </w:p>
-        </w:tc>
-        <w:tc>
-          <w:tcPr>
-            <w:tcW w:type="dxa" w:w="1483"/>
+            <w:tcW w:type="dxa" w:w="1417"/>
             <w:vAlign w:val="center"/>
             <w:tcMar>
               <w:top w:w="80" w:type="dxa"/>
@@ -4911,7 +4900,7 @@
         </w:tc>
         <w:tc>
           <w:tcPr>
-            <w:tcW w:type="dxa" w:w="3188"/>
+            <w:tcW w:type="dxa" w:w="3969"/>
             <w:vAlign w:val="center"/>
             <w:tcMar>
               <w:top w:w="80" w:type="dxa"/>
@@ -4932,13 +4921,13 @@
                 <w:color w:val="20201F"/>
                 <w:sz w:val="16"/>
               </w:rPr>
-              <w:t>Conditions and comparator</w:t>
+              <w:t>Controlled setup</w:t>
             </w:r>
           </w:p>
         </w:tc>
         <w:tc>
           <w:tcPr>
-            <w:tcW w:type="dxa" w:w="2298"/>
+            <w:tcW w:type="dxa" w:w="4252"/>
             <w:vAlign w:val="center"/>
             <w:tcMar>
               <w:top w:w="80" w:type="dxa"/>
@@ -4959,34 +4948,7 @@
                 <w:color w:val="20201F"/>
                 <w:sz w:val="16"/>
               </w:rPr>
-              <w:t>Primary outputs</w:t>
-            </w:r>
-          </w:p>
-        </w:tc>
-        <w:tc>
-          <w:tcPr>
-            <w:tcW w:type="dxa" w:w="1779"/>
-            <w:vAlign w:val="center"/>
-            <w:tcMar>
-              <w:top w:w="80" w:type="dxa"/>
-              <w:bottom w:w="80" w:type="dxa"/>
-              <w:start w:w="120" w:type="dxa"/>
-              <w:end w:w="120" w:type="dxa"/>
-            </w:tcMar>
-            <w:shd w:val="clear" w:color="auto" w:fill="F2F1ED"/>
-          </w:tcPr>
-          <w:p>
-            <w:pPr>
-              <w:pStyle w:val="TableText"/>
-            </w:pPr>
-            <w:r>
-              <w:rPr>
-                <w:rFonts w:ascii="Arial" w:hAnsi="Arial" w:eastAsia="Arial" w:cs="Arial"/>
-                <w:b/>
-                <w:color w:val="20201F"/>
-                <w:sz w:val="16"/>
-              </w:rPr>
-              <w:t>Acceptance rule</w:t>
+              <w:t>Measurement and decision record</w:t>
             </w:r>
           </w:p>
         </w:tc>
@@ -4997,7 +4959,7 @@
         </w:trPr>
         <w:tc>
           <w:tcPr>
-            <w:tcW w:type="dxa" w:w="890"/>
+            <w:tcW w:type="dxa" w:w="1417"/>
             <w:vAlign w:val="center"/>
             <w:tcMar>
               <w:top w:w="80" w:type="dxa"/>
@@ -5018,12 +4980,16 @@
                 <w:sz w:val="16"/>
               </w:rPr>
               <w:t>PE-01</w:t>
+              <w:br/>
+              <w:t>PROTOCOL-01</w:t>
+              <w:br/>
+              <w:t>Climate sensing</w:t>
             </w:r>
           </w:p>
         </w:tc>
         <w:tc>
           <w:tcPr>
-            <w:tcW w:type="dxa" w:w="1483"/>
+            <w:tcW w:type="dxa" w:w="3969"/>
             <w:vAlign w:val="center"/>
             <w:tcMar>
               <w:top w:w="80" w:type="dxa"/>
@@ -5043,13 +5009,23 @@
                 <w:color w:val="20201F"/>
                 <w:sz w:val="16"/>
               </w:rPr>
-              <w:t>Climate sensing</w:t>
+              <w:t>Hardware revision: Target revision not yet assigned</w:t>
+              <w:br/>
+              <w:t>Firmware revision: Target revision not yet assigned</w:t>
+              <w:br/>
+              <w:t>Conditions: Relevant temperature and humidity conditions</w:t>
+              <w:br/>
+              <w:t>Comparator / ground truth: Traceable reference logger</w:t>
+              <w:br/>
+              <w:t>Sample interval: Defined before testing</w:t>
+              <w:br/>
+              <w:t>Repeated trials: Defined before testing</w:t>
             </w:r>
           </w:p>
         </w:tc>
         <w:tc>
           <w:tcPr>
-            <w:tcW w:type="dxa" w:w="3188"/>
+            <w:tcW w:type="dxa" w:w="4252"/>
             <w:vAlign w:val="center"/>
             <w:tcMar>
               <w:top w:w="80" w:type="dxa"/>
@@ -5069,61 +5045,19 @@
                 <w:color w:val="20201F"/>
                 <w:sz w:val="16"/>
               </w:rPr>
-              <w:t>Relevant temperature and humidity conditions</w:t>
+              <w:t>Primary outcomes: bias; mean absolute error; repeatability; measurement uncertainty</w:t>
               <w:br/>
-              <w:t>Comparator / ground truth: Traceable reference logger</w:t>
-            </w:r>
-          </w:p>
-        </w:tc>
-        <w:tc>
-          <w:tcPr>
-            <w:tcW w:type="dxa" w:w="2298"/>
-            <w:vAlign w:val="center"/>
-            <w:tcMar>
-              <w:top w:w="80" w:type="dxa"/>
-              <w:bottom w:w="80" w:type="dxa"/>
-              <w:start w:w="120" w:type="dxa"/>
-              <w:end w:w="120" w:type="dxa"/>
-            </w:tcMar>
-          </w:tcPr>
-          <w:p>
-            <w:pPr>
-              <w:pStyle w:val="TableText"/>
-            </w:pPr>
-            <w:r>
-              <w:rPr>
-                <w:rFonts w:ascii="Arial" w:hAnsi="Arial" w:eastAsia="Arial" w:cs="Arial"/>
-                <w:b w:val="0"/>
-                <w:color w:val="20201F"/>
-                <w:sz w:val="16"/>
-              </w:rPr>
-              <w:t>bias; mean absolute error; repeatability; measurement uncertainty</w:t>
-            </w:r>
-          </w:p>
-        </w:tc>
-        <w:tc>
-          <w:tcPr>
-            <w:tcW w:type="dxa" w:w="1779"/>
-            <w:vAlign w:val="center"/>
-            <w:tcMar>
-              <w:top w:w="80" w:type="dxa"/>
-              <w:bottom w:w="80" w:type="dxa"/>
-              <w:start w:w="120" w:type="dxa"/>
-              <w:end w:w="120" w:type="dxa"/>
-            </w:tcMar>
-          </w:tcPr>
-          <w:p>
-            <w:pPr>
-              <w:pStyle w:val="TableText"/>
-            </w:pPr>
-            <w:r>
-              <w:rPr>
-                <w:rFonts w:ascii="Arial" w:hAnsi="Arial" w:eastAsia="Arial" w:cs="Arial"/>
-                <w:b w:val="0"/>
-                <w:color w:val="20201F"/>
-                <w:sz w:val="16"/>
-              </w:rPr>
-              <w:t>Pre-registered before testing</w:t>
+              <w:t>Secondary outcomes: sampling interval; stabilization time</w:t>
+              <w:br/>
+              <w:t>Acceptance criterion: Defined before testing</w:t>
+              <w:br/>
+              <w:t>Exclusions / missing data: Defined before testing</w:t>
+              <w:br/>
+              <w:t>Uncertainty: Defined before testing</w:t>
+              <w:br/>
+              <w:t>Retained artifact: Not yet assigned</w:t>
+              <w:br/>
+              <w:t>Reporting: Trial counts, negative results, protocol deviations, raw and derived data location, and analysis version.</w:t>
             </w:r>
           </w:p>
         </w:tc>
@@ -5134,7 +5068,7 @@
         </w:trPr>
         <w:tc>
           <w:tcPr>
-            <w:tcW w:type="dxa" w:w="890"/>
+            <w:tcW w:type="dxa" w:w="1417"/>
             <w:vAlign w:val="center"/>
             <w:tcMar>
               <w:top w:w="80" w:type="dxa"/>
@@ -5155,12 +5089,16 @@
                 <w:sz w:val="16"/>
               </w:rPr>
               <w:t>PE-02</w:t>
+              <w:br/>
+              <w:t>PROTOCOL-02</w:t>
+              <w:br/>
+              <w:t>Presence sensing</w:t>
             </w:r>
           </w:p>
         </w:tc>
         <w:tc>
           <w:tcPr>
-            <w:tcW w:type="dxa" w:w="1483"/>
+            <w:tcW w:type="dxa" w:w="3969"/>
             <w:vAlign w:val="center"/>
             <w:tcMar>
               <w:top w:w="80" w:type="dxa"/>
@@ -5180,13 +5118,23 @@
                 <w:color w:val="20201F"/>
                 <w:sz w:val="16"/>
               </w:rPr>
-              <w:t>Presence sensing</w:t>
+              <w:t>Hardware revision: Target revision not yet assigned</w:t>
+              <w:br/>
+              <w:t>Firmware revision: Target revision not yet assigned</w:t>
+              <w:br/>
+              <w:t>Conditions: Occupied, unoccupied, stationary, moving, obstructed, placement, and false-trigger scenarios</w:t>
+              <w:br/>
+              <w:t>Comparator / ground truth: Timestamped ground truth</w:t>
+              <w:br/>
+              <w:t>Sample interval: Defined before testing</w:t>
+              <w:br/>
+              <w:t>Repeated trials: Defined before testing</w:t>
             </w:r>
           </w:p>
         </w:tc>
         <w:tc>
           <w:tcPr>
-            <w:tcW w:type="dxa" w:w="3188"/>
+            <w:tcW w:type="dxa" w:w="4252"/>
             <w:vAlign w:val="center"/>
             <w:tcMar>
               <w:top w:w="80" w:type="dxa"/>
@@ -5206,61 +5154,19 @@
                 <w:color w:val="20201F"/>
                 <w:sz w:val="16"/>
               </w:rPr>
-              <w:t>Occupied, unoccupied, stationary, moving, obstructed, placement, and false-trigger scenarios</w:t>
+              <w:t>Primary outcomes: sensitivity; specificity or false-positive rate; response latency</w:t>
               <w:br/>
-              <w:t>Comparator / ground truth: Timestamped ground truth</w:t>
-            </w:r>
-          </w:p>
-        </w:tc>
-        <w:tc>
-          <w:tcPr>
-            <w:tcW w:type="dxa" w:w="2298"/>
-            <w:vAlign w:val="center"/>
-            <w:tcMar>
-              <w:top w:w="80" w:type="dxa"/>
-              <w:bottom w:w="80" w:type="dxa"/>
-              <w:start w:w="120" w:type="dxa"/>
-              <w:end w:w="120" w:type="dxa"/>
-            </w:tcMar>
-          </w:tcPr>
-          <w:p>
-            <w:pPr>
-              <w:pStyle w:val="TableText"/>
-            </w:pPr>
-            <w:r>
-              <w:rPr>
-                <w:rFonts w:ascii="Arial" w:hAnsi="Arial" w:eastAsia="Arial" w:cs="Arial"/>
-                <w:b w:val="0"/>
-                <w:color w:val="20201F"/>
-                <w:sz w:val="16"/>
-              </w:rPr>
-              <w:t>sensitivity; specificity or false-positive rate; response latency</w:t>
-            </w:r>
-          </w:p>
-        </w:tc>
-        <w:tc>
-          <w:tcPr>
-            <w:tcW w:type="dxa" w:w="1779"/>
-            <w:vAlign w:val="center"/>
-            <w:tcMar>
-              <w:top w:w="80" w:type="dxa"/>
-              <w:bottom w:w="80" w:type="dxa"/>
-              <w:start w:w="120" w:type="dxa"/>
-              <w:end w:w="120" w:type="dxa"/>
-            </w:tcMar>
-          </w:tcPr>
-          <w:p>
-            <w:pPr>
-              <w:pStyle w:val="TableText"/>
-            </w:pPr>
-            <w:r>
-              <w:rPr>
-                <w:rFonts w:ascii="Arial" w:hAnsi="Arial" w:eastAsia="Arial" w:cs="Arial"/>
-                <w:b w:val="0"/>
-                <w:color w:val="20201F"/>
-                <w:sz w:val="16"/>
-              </w:rPr>
-              <w:t>Pre-registered before testing</w:t>
+              <w:t>Secondary outcomes: false-trigger scenarios</w:t>
+              <w:br/>
+              <w:t>Acceptance criterion: Defined before testing</w:t>
+              <w:br/>
+              <w:t>Exclusions / missing data: Defined before testing</w:t>
+              <w:br/>
+              <w:t>Uncertainty: Defined before testing</w:t>
+              <w:br/>
+              <w:t>Retained artifact: Not yet assigned</w:t>
+              <w:br/>
+              <w:t>Reporting: Trial counts, negative results, protocol deviations, raw and derived data location, and analysis version.</w:t>
             </w:r>
           </w:p>
         </w:tc>
@@ -5271,7 +5177,7 @@
         </w:trPr>
         <w:tc>
           <w:tcPr>
-            <w:tcW w:type="dxa" w:w="890"/>
+            <w:tcW w:type="dxa" w:w="1417"/>
             <w:vAlign w:val="center"/>
             <w:tcMar>
               <w:top w:w="80" w:type="dxa"/>
@@ -5292,12 +5198,16 @@
                 <w:sz w:val="16"/>
               </w:rPr>
               <w:t>PE-03</w:t>
+              <w:br/>
+              <w:t>PROTOCOL-03</w:t>
+              <w:br/>
+              <w:t>IR interoperability</w:t>
             </w:r>
           </w:p>
         </w:tc>
         <w:tc>
           <w:tcPr>
-            <w:tcW w:type="dxa" w:w="1483"/>
+            <w:tcW w:type="dxa" w:w="3969"/>
             <w:vAlign w:val="center"/>
             <w:tcMar>
               <w:top w:w="80" w:type="dxa"/>
@@ -5317,13 +5227,23 @@
                 <w:color w:val="20201F"/>
                 <w:sz w:val="16"/>
               </w:rPr>
-              <w:t>IR interoperability</w:t>
+              <w:t>Hardware revision: Target revision not yet assigned</w:t>
+              <w:br/>
+              <w:t>Firmware revision: Target revision not yet assigned</w:t>
+              <w:br/>
+              <w:t>Conditions: Declared stratified AC sample; repeated distances, angles, and line-of-sight conditions</w:t>
+              <w:br/>
+              <w:t>Comparator / ground truth: Declared AC brand, model, and command set</w:t>
+              <w:br/>
+              <w:t>Sample interval: Defined before testing</w:t>
+              <w:br/>
+              <w:t>Repeated trials: Defined before testing</w:t>
             </w:r>
           </w:p>
         </w:tc>
         <w:tc>
           <w:tcPr>
-            <w:tcW w:type="dxa" w:w="3188"/>
+            <w:tcW w:type="dxa" w:w="4252"/>
             <w:vAlign w:val="center"/>
             <w:tcMar>
               <w:top w:w="80" w:type="dxa"/>
@@ -5343,61 +5263,19 @@
                 <w:color w:val="20201F"/>
                 <w:sz w:val="16"/>
               </w:rPr>
-              <w:t>Declared stratified AC sample; repeated distances, angles, and line-of-sight conditions</w:t>
+              <w:t>Primary outcomes: model-level successes; model-level failures</w:t>
               <w:br/>
-              <w:t>Comparator / ground truth: Declared AC brand, model, and command set</w:t>
-            </w:r>
-          </w:p>
-        </w:tc>
-        <w:tc>
-          <w:tcPr>
-            <w:tcW w:type="dxa" w:w="2298"/>
-            <w:vAlign w:val="center"/>
-            <w:tcMar>
-              <w:top w:w="80" w:type="dxa"/>
-              <w:bottom w:w="80" w:type="dxa"/>
-              <w:start w:w="120" w:type="dxa"/>
-              <w:end w:w="120" w:type="dxa"/>
-            </w:tcMar>
-          </w:tcPr>
-          <w:p>
-            <w:pPr>
-              <w:pStyle w:val="TableText"/>
-            </w:pPr>
-            <w:r>
-              <w:rPr>
-                <w:rFonts w:ascii="Arial" w:hAnsi="Arial" w:eastAsia="Arial" w:cs="Arial"/>
-                <w:b w:val="0"/>
-                <w:color w:val="20201F"/>
-                <w:sz w:val="16"/>
-              </w:rPr>
-              <w:t>model-level successes; model-level failures</w:t>
-            </w:r>
-          </w:p>
-        </w:tc>
-        <w:tc>
-          <w:tcPr>
-            <w:tcW w:type="dxa" w:w="1779"/>
-            <w:vAlign w:val="center"/>
-            <w:tcMar>
-              <w:top w:w="80" w:type="dxa"/>
-              <w:bottom w:w="80" w:type="dxa"/>
-              <w:start w:w="120" w:type="dxa"/>
-              <w:end w:w="120" w:type="dxa"/>
-            </w:tcMar>
-          </w:tcPr>
-          <w:p>
-            <w:pPr>
-              <w:pStyle w:val="TableText"/>
-            </w:pPr>
-            <w:r>
-              <w:rPr>
-                <w:rFonts w:ascii="Arial" w:hAnsi="Arial" w:eastAsia="Arial" w:cs="Arial"/>
-                <w:b w:val="0"/>
-                <w:color w:val="20201F"/>
-                <w:sz w:val="16"/>
-              </w:rPr>
-              <w:t>Pre-registered before testing</w:t>
+              <w:t>Secondary outcomes: distance; angle; line-of-sight condition</w:t>
+              <w:br/>
+              <w:t>Acceptance criterion: Defined before testing</w:t>
+              <w:br/>
+              <w:t>Exclusions / missing data: Defined before testing</w:t>
+              <w:br/>
+              <w:t>Uncertainty: Defined before testing</w:t>
+              <w:br/>
+              <w:t>Retained artifact: Not yet assigned</w:t>
+              <w:br/>
+              <w:t>Reporting: Trial counts, negative results, protocol deviations, raw and derived data location, and analysis version.</w:t>
             </w:r>
           </w:p>
         </w:tc>
@@ -5408,7 +5286,7 @@
         </w:trPr>
         <w:tc>
           <w:tcPr>
-            <w:tcW w:type="dxa" w:w="890"/>
+            <w:tcW w:type="dxa" w:w="1417"/>
             <w:vAlign w:val="center"/>
             <w:tcMar>
               <w:top w:w="80" w:type="dxa"/>
@@ -5429,12 +5307,16 @@
                 <w:sz w:val="16"/>
               </w:rPr>
               <w:t>PE-04</w:t>
+              <w:br/>
+              <w:t>PROTOCOL-04</w:t>
+              <w:br/>
+              <w:t>Offline control</w:t>
             </w:r>
           </w:p>
         </w:tc>
         <w:tc>
           <w:tcPr>
-            <w:tcW w:type="dxa" w:w="1483"/>
+            <w:tcW w:type="dxa" w:w="3969"/>
             <w:vAlign w:val="center"/>
             <w:tcMar>
               <w:top w:w="80" w:type="dxa"/>
@@ -5454,13 +5336,23 @@
                 <w:color w:val="20201F"/>
                 <w:sz w:val="16"/>
               </w:rPr>
-              <w:t>Offline control</w:t>
+              <w:t>Hardware revision: Target revision not yet assigned</w:t>
+              <w:br/>
+              <w:t>Firmware revision: Target revision not yet assigned</w:t>
+              <w:br/>
+              <w:t>Conditions: Wi-Fi and internet disabled after setup for a stated duration</w:t>
+              <w:br/>
+              <w:t>Comparator / ground truth: Configured device before network loss</w:t>
+              <w:br/>
+              <w:t>Sample interval: Defined before testing</w:t>
+              <w:br/>
+              <w:t>Repeated trials: Defined before testing</w:t>
             </w:r>
           </w:p>
         </w:tc>
         <w:tc>
           <w:tcPr>
-            <w:tcW w:type="dxa" w:w="3188"/>
+            <w:tcW w:type="dxa" w:w="4252"/>
             <w:vAlign w:val="center"/>
             <w:tcMar>
               <w:top w:w="80" w:type="dxa"/>
@@ -5480,61 +5372,19 @@
                 <w:color w:val="20201F"/>
                 <w:sz w:val="16"/>
               </w:rPr>
-              <w:t>Wi-Fi and internet disabled after setup for a stated duration</w:t>
+              <w:t>Primary outcomes: sensing, decision, command, reboot, and reconnection behavior</w:t>
               <w:br/>
-              <w:t>Comparator / ground truth: Configured device before network loss</w:t>
-            </w:r>
-          </w:p>
-        </w:tc>
-        <w:tc>
-          <w:tcPr>
-            <w:tcW w:type="dxa" w:w="2298"/>
-            <w:vAlign w:val="center"/>
-            <w:tcMar>
-              <w:top w:w="80" w:type="dxa"/>
-              <w:bottom w:w="80" w:type="dxa"/>
-              <w:start w:w="120" w:type="dxa"/>
-              <w:end w:w="120" w:type="dxa"/>
-            </w:tcMar>
-          </w:tcPr>
-          <w:p>
-            <w:pPr>
-              <w:pStyle w:val="TableText"/>
-            </w:pPr>
-            <w:r>
-              <w:rPr>
-                <w:rFonts w:ascii="Arial" w:hAnsi="Arial" w:eastAsia="Arial" w:cs="Arial"/>
-                <w:b w:val="0"/>
-                <w:color w:val="20201F"/>
-                <w:sz w:val="16"/>
-              </w:rPr>
-              <w:t>sensing, decision, command, reboot, and reconnection behavior</w:t>
-            </w:r>
-          </w:p>
-        </w:tc>
-        <w:tc>
-          <w:tcPr>
-            <w:tcW w:type="dxa" w:w="1779"/>
-            <w:vAlign w:val="center"/>
-            <w:tcMar>
-              <w:top w:w="80" w:type="dxa"/>
-              <w:bottom w:w="80" w:type="dxa"/>
-              <w:start w:w="120" w:type="dxa"/>
-              <w:end w:w="120" w:type="dxa"/>
-            </w:tcMar>
-          </w:tcPr>
-          <w:p>
-            <w:pPr>
-              <w:pStyle w:val="TableText"/>
-            </w:pPr>
-            <w:r>
-              <w:rPr>
-                <w:rFonts w:ascii="Arial" w:hAnsi="Arial" w:eastAsia="Arial" w:cs="Arial"/>
-                <w:b w:val="0"/>
-                <w:color w:val="20201F"/>
-                <w:sz w:val="16"/>
-              </w:rPr>
-              <w:t>Pre-registered before testing</w:t>
+              <w:t>Secondary outcomes: network independence distinct from electrical uptime</w:t>
+              <w:br/>
+              <w:t>Acceptance criterion: Defined before testing</w:t>
+              <w:br/>
+              <w:t>Exclusions / missing data: Defined before testing</w:t>
+              <w:br/>
+              <w:t>Uncertainty: Defined before testing</w:t>
+              <w:br/>
+              <w:t>Retained artifact: Not yet assigned</w:t>
+              <w:br/>
+              <w:t>Reporting: Trial counts, negative results, protocol deviations, raw and derived data location, and analysis version.</w:t>
             </w:r>
           </w:p>
         </w:tc>
@@ -5545,7 +5395,7 @@
         </w:trPr>
         <w:tc>
           <w:tcPr>
-            <w:tcW w:type="dxa" w:w="890"/>
+            <w:tcW w:type="dxa" w:w="1417"/>
             <w:vAlign w:val="center"/>
             <w:tcMar>
               <w:top w:w="80" w:type="dxa"/>
@@ -5566,12 +5416,16 @@
                 <w:sz w:val="16"/>
               </w:rPr>
               <w:t>PE-05</w:t>
+              <w:br/>
+              <w:t>PROTOCOL-05</w:t>
+              <w:br/>
+              <w:t>Setup</w:t>
             </w:r>
           </w:p>
         </w:tc>
         <w:tc>
           <w:tcPr>
-            <w:tcW w:type="dxa" w:w="1483"/>
+            <w:tcW w:type="dxa" w:w="3969"/>
             <w:vAlign w:val="center"/>
             <w:tcMar>
               <w:top w:w="80" w:type="dxa"/>
@@ -5591,13 +5445,23 @@
                 <w:color w:val="20201F"/>
                 <w:sz w:val="16"/>
               </w:rPr>
-              <w:t>Setup</w:t>
+              <w:t>Hardware revision: Target revision not yet assigned</w:t>
+              <w:br/>
+              <w:t>Firmware revision: Target revision not yet assigned</w:t>
+              <w:br/>
+              <w:t>Conditions: First-time users completing one defined setup flow</w:t>
+              <w:br/>
+              <w:t>Comparator / ground truth: Observed user task completion</w:t>
+              <w:br/>
+              <w:t>Sample interval: Defined before testing</w:t>
+              <w:br/>
+              <w:t>Repeated trials: Defined before testing</w:t>
             </w:r>
           </w:p>
         </w:tc>
         <w:tc>
           <w:tcPr>
-            <w:tcW w:type="dxa" w:w="3188"/>
+            <w:tcW w:type="dxa" w:w="4252"/>
             <w:vAlign w:val="center"/>
             <w:tcMar>
               <w:top w:w="80" w:type="dxa"/>
@@ -5617,61 +5481,19 @@
                 <w:color w:val="20201F"/>
                 <w:sz w:val="16"/>
               </w:rPr>
-              <w:t>First-time users completing one defined setup flow</w:t>
+              <w:t>Primary outcomes: completion rate; median and range or interquartile range</w:t>
               <w:br/>
-              <w:t>Comparator / ground truth: Observed user task completion</w:t>
-            </w:r>
-          </w:p>
-        </w:tc>
-        <w:tc>
-          <w:tcPr>
-            <w:tcW w:type="dxa" w:w="2298"/>
-            <w:vAlign w:val="center"/>
-            <w:tcMar>
-              <w:top w:w="80" w:type="dxa"/>
-              <w:bottom w:w="80" w:type="dxa"/>
-              <w:start w:w="120" w:type="dxa"/>
-              <w:end w:w="120" w:type="dxa"/>
-            </w:tcMar>
-          </w:tcPr>
-          <w:p>
-            <w:pPr>
-              <w:pStyle w:val="TableText"/>
-            </w:pPr>
-            <w:r>
-              <w:rPr>
-                <w:rFonts w:ascii="Arial" w:hAnsi="Arial" w:eastAsia="Arial" w:cs="Arial"/>
-                <w:b w:val="0"/>
-                <w:color w:val="20201F"/>
-                <w:sz w:val="16"/>
-              </w:rPr>
-              <w:t>completion rate; median and range or interquartile range</w:t>
-            </w:r>
-          </w:p>
-        </w:tc>
-        <w:tc>
-          <w:tcPr>
-            <w:tcW w:type="dxa" w:w="1779"/>
-            <w:vAlign w:val="center"/>
-            <w:tcMar>
-              <w:top w:w="80" w:type="dxa"/>
-              <w:bottom w:w="80" w:type="dxa"/>
-              <w:start w:w="120" w:type="dxa"/>
-              <w:end w:w="120" w:type="dxa"/>
-            </w:tcMar>
-          </w:tcPr>
-          <w:p>
-            <w:pPr>
-              <w:pStyle w:val="TableText"/>
-            </w:pPr>
-            <w:r>
-              <w:rPr>
-                <w:rFonts w:ascii="Arial" w:hAnsi="Arial" w:eastAsia="Arial" w:cs="Arial"/>
-                <w:b w:val="0"/>
-                <w:color w:val="20201F"/>
-                <w:sz w:val="16"/>
-              </w:rPr>
-              <w:t>Pre-registered before testing</w:t>
+              <w:t>Secondary outcomes: assistance; retries; failure reasons</w:t>
+              <w:br/>
+              <w:t>Acceptance criterion: Defined before testing</w:t>
+              <w:br/>
+              <w:t>Exclusions / missing data: Defined before testing</w:t>
+              <w:br/>
+              <w:t>Uncertainty: Defined before testing</w:t>
+              <w:br/>
+              <w:t>Retained artifact: Not yet assigned</w:t>
+              <w:br/>
+              <w:t>Reporting: Trial counts, negative results, protocol deviations, raw and derived data location, and analysis version.</w:t>
             </w:r>
           </w:p>
         </w:tc>
@@ -5682,7 +5504,7 @@
         </w:trPr>
         <w:tc>
           <w:tcPr>
-            <w:tcW w:type="dxa" w:w="890"/>
+            <w:tcW w:type="dxa" w:w="1417"/>
             <w:vAlign w:val="center"/>
             <w:tcMar>
               <w:top w:w="80" w:type="dxa"/>
@@ -5703,12 +5525,16 @@
                 <w:sz w:val="16"/>
               </w:rPr>
               <w:t>PE-06</w:t>
+              <w:br/>
+              <w:t>PROTOCOL-06</w:t>
+              <w:br/>
+              <w:t>Power behavior</w:t>
             </w:r>
           </w:p>
         </w:tc>
         <w:tc>
           <w:tcPr>
-            <w:tcW w:type="dxa" w:w="1483"/>
+            <w:tcW w:type="dxa" w:w="3969"/>
             <w:vAlign w:val="center"/>
             <w:tcMar>
               <w:top w:w="80" w:type="dxa"/>
@@ -5728,13 +5554,23 @@
                 <w:color w:val="20201F"/>
                 <w:sz w:val="16"/>
               </w:rPr>
-              <w:t>Power behavior</w:t>
+              <w:t>Hardware revision: Target revision not yet assigned</w:t>
+              <w:br/>
+              <w:t>Firmware revision: Target revision not yet assigned</w:t>
+              <w:br/>
+              <w:t>Conditions: Declared supported input conditions and brownout/restart scenarios</w:t>
+              <w:br/>
+              <w:t>Comparator / ground truth: Declared measurement equipment</w:t>
+              <w:br/>
+              <w:t>Sample interval: Defined before testing</w:t>
+              <w:br/>
+              <w:t>Repeated trials: Defined before testing</w:t>
             </w:r>
           </w:p>
         </w:tc>
         <w:tc>
           <w:tcPr>
-            <w:tcW w:type="dxa" w:w="3188"/>
+            <w:tcW w:type="dxa" w:w="4252"/>
             <w:vAlign w:val="center"/>
             <w:tcMar>
               <w:top w:w="80" w:type="dxa"/>
@@ -5754,61 +5590,19 @@
                 <w:color w:val="20201F"/>
                 <w:sz w:val="16"/>
               </w:rPr>
-              <w:t>Declared supported input conditions and brownout/restart scenarios</w:t>
+              <w:t>Primary outcomes: nominal draw; peak draw; brownout and restart behavior</w:t>
               <w:br/>
-              <w:t>Comparator / ground truth: Declared measurement equipment</w:t>
-            </w:r>
-          </w:p>
-        </w:tc>
-        <w:tc>
-          <w:tcPr>
-            <w:tcW w:type="dxa" w:w="2298"/>
-            <w:vAlign w:val="center"/>
-            <w:tcMar>
-              <w:top w:w="80" w:type="dxa"/>
-              <w:bottom w:w="80" w:type="dxa"/>
-              <w:start w:w="120" w:type="dxa"/>
-              <w:end w:w="120" w:type="dxa"/>
-            </w:tcMar>
-          </w:tcPr>
-          <w:p>
-            <w:pPr>
-              <w:pStyle w:val="TableText"/>
-            </w:pPr>
-            <w:r>
-              <w:rPr>
-                <w:rFonts w:ascii="Arial" w:hAnsi="Arial" w:eastAsia="Arial" w:cs="Arial"/>
-                <w:b w:val="0"/>
-                <w:color w:val="20201F"/>
-                <w:sz w:val="16"/>
-              </w:rPr>
-              <w:t>nominal draw; peak draw; brownout and restart behavior</w:t>
-            </w:r>
-          </w:p>
-        </w:tc>
-        <w:tc>
-          <w:tcPr>
-            <w:tcW w:type="dxa" w:w="1779"/>
-            <w:vAlign w:val="center"/>
-            <w:tcMar>
-              <w:top w:w="80" w:type="dxa"/>
-              <w:bottom w:w="80" w:type="dxa"/>
-              <w:start w:w="120" w:type="dxa"/>
-              <w:end w:w="120" w:type="dxa"/>
-            </w:tcMar>
-          </w:tcPr>
-          <w:p>
-            <w:pPr>
-              <w:pStyle w:val="TableText"/>
-            </w:pPr>
-            <w:r>
-              <w:rPr>
-                <w:rFonts w:ascii="Arial" w:hAnsi="Arial" w:eastAsia="Arial" w:cs="Arial"/>
-                <w:b w:val="0"/>
-                <w:color w:val="20201F"/>
-                <w:sz w:val="16"/>
-              </w:rPr>
-              <w:t>Pre-registered before testing</w:t>
+              <w:t>Secondary outcomes: recovery state</w:t>
+              <w:br/>
+              <w:t>Acceptance criterion: Defined before testing</w:t>
+              <w:br/>
+              <w:t>Exclusions / missing data: Defined before testing</w:t>
+              <w:br/>
+              <w:t>Uncertainty: Defined before testing</w:t>
+              <w:br/>
+              <w:t>Retained artifact: Not yet assigned</w:t>
+              <w:br/>
+              <w:t>Reporting: Trial counts, negative results, protocol deviations, raw and derived data location, and analysis version.</w:t>
             </w:r>
           </w:p>
         </w:tc>
@@ -5819,7 +5613,7 @@
         </w:trPr>
         <w:tc>
           <w:tcPr>
-            <w:tcW w:type="dxa" w:w="890"/>
+            <w:tcW w:type="dxa" w:w="1417"/>
             <w:vAlign w:val="center"/>
             <w:tcMar>
               <w:top w:w="80" w:type="dxa"/>
@@ -5840,12 +5634,16 @@
                 <w:sz w:val="16"/>
               </w:rPr>
               <w:t>PE-07</w:t>
+              <w:br/>
+              <w:t>PROTOCOL-07</w:t>
+              <w:br/>
+              <w:t>Room comfort stability</w:t>
             </w:r>
           </w:p>
         </w:tc>
         <w:tc>
           <w:tcPr>
-            <w:tcW w:type="dxa" w:w="1483"/>
+            <w:tcW w:type="dxa" w:w="3969"/>
             <w:vAlign w:val="center"/>
             <w:tcMar>
               <w:top w:w="80" w:type="dxa"/>
@@ -5865,13 +5663,23 @@
                 <w:color w:val="20201F"/>
                 <w:sz w:val="16"/>
               </w:rPr>
-              <w:t>Room comfort stability</w:t>
+              <w:t>Hardware revision: Target revision not yet assigned</w:t>
+              <w:br/>
+              <w:t>Firmware revision: Target revision not yet assigned</w:t>
+              <w:br/>
+              <w:t>Conditions: Recorded room geometry, placement, AC model, loads, outdoor conditions, and occupancy</w:t>
+              <w:br/>
+              <w:t>Comparator / ground truth: Randomized or counterbalanced baseline-versus-ROOT comparison</w:t>
+              <w:br/>
+              <w:t>Sample interval: Defined before testing</w:t>
+              <w:br/>
+              <w:t>Repeated trials: Defined before testing</w:t>
             </w:r>
           </w:p>
         </w:tc>
         <w:tc>
           <w:tcPr>
-            <w:tcW w:type="dxa" w:w="3188"/>
+            <w:tcW w:type="dxa" w:w="4252"/>
             <w:vAlign w:val="center"/>
             <w:tcMar>
               <w:top w:w="80" w:type="dxa"/>
@@ -5891,61 +5699,19 @@
                 <w:color w:val="20201F"/>
                 <w:sz w:val="16"/>
               </w:rPr>
-              <w:t>Recorded room geometry, placement, AC model, loads, outdoor conditions, and occupancy</w:t>
+              <w:t>Primary outcomes: occupant-zone deviation; overshoot; cycling; humidity</w:t>
               <w:br/>
-              <w:t>Comparator / ground truth: Randomized or counterbalanced baseline-versus-ROOT comparison</w:t>
-            </w:r>
-          </w:p>
-        </w:tc>
-        <w:tc>
-          <w:tcPr>
-            <w:tcW w:type="dxa" w:w="2298"/>
-            <w:vAlign w:val="center"/>
-            <w:tcMar>
-              <w:top w:w="80" w:type="dxa"/>
-              <w:bottom w:w="80" w:type="dxa"/>
-              <w:start w:w="120" w:type="dxa"/>
-              <w:end w:w="120" w:type="dxa"/>
-            </w:tcMar>
-          </w:tcPr>
-          <w:p>
-            <w:pPr>
-              <w:pStyle w:val="TableText"/>
-            </w:pPr>
-            <w:r>
-              <w:rPr>
-                <w:rFonts w:ascii="Arial" w:hAnsi="Arial" w:eastAsia="Arial" w:cs="Arial"/>
-                <w:b w:val="0"/>
-                <w:color w:val="20201F"/>
-                <w:sz w:val="16"/>
-              </w:rPr>
-              <w:t>occupant-zone deviation; overshoot; cycling; humidity</w:t>
-            </w:r>
-          </w:p>
-        </w:tc>
-        <w:tc>
-          <w:tcPr>
-            <w:tcW w:type="dxa" w:w="1779"/>
-            <w:vAlign w:val="center"/>
-            <w:tcMar>
-              <w:top w:w="80" w:type="dxa"/>
-              <w:bottom w:w="80" w:type="dxa"/>
-              <w:start w:w="120" w:type="dxa"/>
-              <w:end w:w="120" w:type="dxa"/>
-            </w:tcMar>
-          </w:tcPr>
-          <w:p>
-            <w:pPr>
-              <w:pStyle w:val="TableText"/>
-            </w:pPr>
-            <w:r>
-              <w:rPr>
-                <w:rFonts w:ascii="Arial" w:hAnsi="Arial" w:eastAsia="Arial" w:cs="Arial"/>
-                <w:b w:val="0"/>
-                <w:color w:val="20201F"/>
-                <w:sz w:val="16"/>
-              </w:rPr>
-              <w:t>Pre-registered before testing</w:t>
+              <w:t>Secondary outcomes: recorded room and operating conditions</w:t>
+              <w:br/>
+              <w:t>Acceptance criterion: Defined before testing</w:t>
+              <w:br/>
+              <w:t>Exclusions / missing data: Defined before testing</w:t>
+              <w:br/>
+              <w:t>Uncertainty: Defined before testing</w:t>
+              <w:br/>
+              <w:t>Retained artifact: Not yet assigned</w:t>
+              <w:br/>
+              <w:t>Reporting: Trial counts, negative results, protocol deviations, raw and derived data location, and analysis version.</w:t>
             </w:r>
           </w:p>
         </w:tc>

</xml_diff>